<commit_message>
implemented the ssi algorithm in the streamlit app
</commit_message>
<xml_diff>
--- a/05 Deliverables/Conference paper.docx
+++ b/05 Deliverables/Conference paper.docx
@@ -8,7 +8,7 @@
         <w:jc w:val="center"/>
       </w:pPr>
       <w:r>
-        <w:t>A Computer Vision Framework for Multi-Class Player Detection and Tracking in Soccer Broadcast Footage</w:t>
+        <w:t>A Computer Vision Framework for Multi-Class Detection and Tracking in Soccer Broadcast Footage</w:t>
       </w:r>
     </w:p>
     <w:p>
@@ -29,392 +29,585 @@
     </w:p>
     <w:p>
       <w:r>
-        <w:t xml:space="preserve">The use of artificial intelligence in soccer analytics is rapidly expanding, yet most professional tracking systems still rely on expensive multi-camera setups that limit accessibility for lower-resource teams. This paper investigates whether coordinate and event-level information can be reliably extracted from raw broadcast footage using a single-camera, computer vision–based pipeline. </w:t>
-      </w:r>
-      <w:r>
-        <w:t>In this paper we</w:t>
-      </w:r>
-      <w:r>
-        <w:t xml:space="preserve"> develop a system that combines a YOLO object detection model, a </w:t>
+        <w:t>Clubs with access to expensive multi-camera setups or GPS tracking systems gain a competitive advantage through detailed data, whereas lower-budget teams are often unable to collect similar information. This paper ex</w:t>
+      </w:r>
+      <w:r>
+        <w:t>amin</w:t>
+      </w:r>
+      <w:r>
+        <w:t>es whether such data can instead be extracted directly from standard broadcast footage using a single-camera computer</w:t>
+      </w:r>
+      <w:r>
+        <w:t>-</w:t>
+      </w:r>
+      <w:r>
+        <w:t>vision pipeline.</w:t>
+      </w:r>
+      <w:r>
+        <w:t xml:space="preserve"> This project</w:t>
+      </w:r>
+      <w:r>
+        <w:t xml:space="preserve"> develop</w:t>
+      </w:r>
+      <w:r>
+        <w:t>s</w:t>
+      </w:r>
+      <w:r>
+        <w:t xml:space="preserve"> an end-to-end system that combines a YOLO object detector with the </w:t>
       </w:r>
       <w:proofErr w:type="spellStart"/>
       <w:r>
-        <w:t>keypoint</w:t>
+        <w:t>ByteTrack</w:t>
       </w:r>
       <w:proofErr w:type="spellEnd"/>
       <w:r>
-        <w:t xml:space="preserve"> pitch detector, and the </w:t>
+        <w:t xml:space="preserve"> tracking algorithm to identify and track players, referees, goalkeepers, and the ball throughout a match. Experimental results show that the pipeline achieves high performance in detecting and tracking players and officials, with strong precision, recall, and mAP50 scores, while ball detection remains the primary challenge. Despite this limitation, our findings demonstrate that AI can extract meaningful player-level spatial information from a single broadcast camera. By reducing reliance on specialized hardware, the proposed approach enables colleges, academies, and amateur clubs to adopt scalable, data-driven analysis methods previously accessible only to professional teams, highlighting the potential for affordable computer vision–based soccer analytics.</w:t>
+      </w:r>
+    </w:p>
+    <w:p>
+      <w:pPr>
+        <w:pStyle w:val="Heading1"/>
+      </w:pPr>
+      <w:r>
+        <w:t>Introduction</w:t>
+      </w:r>
+    </w:p>
+    <w:p>
+      <w:r>
+        <w:t>Clubs that adopted data analytics early have already demonstrated its competitive value, inspiring others to follow.</w:t>
+      </w:r>
+      <w:r>
+        <w:t xml:space="preserve"> </w:t>
+      </w:r>
+      <w:r>
+        <w:t>One of the most notable examples is Brighton &amp; Hove Albion. Their analytics-driven recruitment strategy has produced multiple high-profile successes: Moisés Caicedo was purchased for £4 million and later sold for £115 million; Alexis Mac Allister joined for £6.9 million and was sold for £35 million; Kaoru Mitoma arrived for £2.6 million and is now valued above £50 million</w:t>
+      </w:r>
+      <w:r>
+        <w:t xml:space="preserve"> (</w:t>
+      </w:r>
+      <w:r>
+        <w:t>Transfermarkt</w:t>
+      </w:r>
+      <w:r>
+        <w:t>)</w:t>
+      </w:r>
+      <w:r>
+        <w:t>. These are not isolated cases but indicators of a systematic, data-informed process. Brighton’s Technical Director, David Weir, highlighted this advantage when he said that the club is “fortunate to have access to all the information from every league in the world, which you’d never be able to cover on a scouting, subjective, eyes-on basis.”</w:t>
+      </w:r>
+      <w:r>
+        <w:t>(</w:t>
+      </w:r>
+      <w:r>
+        <w:t>Kershaw</w:t>
+      </w:r>
+      <w:r>
+        <w:t>)</w:t>
+      </w:r>
+      <w:r>
+        <w:t xml:space="preserve"> Analytics have contributed significantly to Brighton becoming one of the most profitable clubs in the Premier League during the period </w:t>
+      </w:r>
+      <w:r>
+        <w:lastRenderedPageBreak/>
+        <w:t>from 2019 to 2023 (Swiss Ramble).</w:t>
+      </w:r>
+      <w:r>
+        <w:t xml:space="preserve"> </w:t>
+      </w:r>
+      <w:r>
+        <w:t xml:space="preserve">This context demonstrates why the integration of data and AI is transformative. </w:t>
+      </w:r>
+    </w:p>
+    <w:p>
+      <w:r>
+        <w:t>Unfortunately</w:t>
+      </w:r>
+      <w:r>
+        <w:t xml:space="preserve">, data does not appear by itself. As Weir implied, it is impossible for scouts to </w:t>
+      </w:r>
+      <w:r>
+        <w:t>monitor</w:t>
+      </w:r>
+      <w:r>
+        <w:t xml:space="preserve"> every player across every league and </w:t>
+      </w:r>
+      <w:r>
+        <w:t xml:space="preserve">manually </w:t>
+      </w:r>
+      <w:r>
+        <w:t xml:space="preserve">extract meaningful insights. Computer vision </w:t>
+      </w:r>
+      <w:r>
+        <w:t>can offer</w:t>
+      </w:r>
+      <w:r>
+        <w:t xml:space="preserve"> a scalable solution</w:t>
+      </w:r>
+      <w:r>
+        <w:t>.</w:t>
+      </w:r>
+      <w:r>
+        <w:t xml:space="preserve"> </w:t>
+      </w:r>
+      <w:r>
+        <w:t>I</w:t>
+      </w:r>
+      <w:r>
+        <w:t>t</w:t>
+      </w:r>
+      <w:r>
+        <w:t xml:space="preserve"> can</w:t>
+      </w:r>
+      <w:r>
+        <w:t xml:space="preserve"> </w:t>
+      </w:r>
+      <w:r>
+        <w:t>enable</w:t>
+      </w:r>
+      <w:r>
+        <w:t xml:space="preserve"> clubs to construct pipelines that automatically extract </w:t>
+      </w:r>
+      <w:r>
+        <w:t>data from</w:t>
+      </w:r>
+      <w:r>
+        <w:t xml:space="preserve"> footage</w:t>
+      </w:r>
+      <w:r>
+        <w:t xml:space="preserve"> and present it in a suitable format to facilitate monitoring a larger number of players</w:t>
+      </w:r>
+      <w:r>
+        <w:t>.</w:t>
+      </w:r>
+      <w:r>
+        <w:t xml:space="preserve"> The first stages of this pipeline would be getting artificial intelligence to detect and track players, goalkeepers, the ball, and the referee.</w:t>
+      </w:r>
+      <w:r>
+        <w:t xml:space="preserve"> This paper </w:t>
+      </w:r>
+      <w:r>
+        <w:t>investigates</w:t>
+      </w:r>
+      <w:r>
+        <w:t xml:space="preserve"> that foundational step</w:t>
+      </w:r>
+      <w:r>
+        <w:t>. Specifically,</w:t>
+      </w:r>
+      <w:r>
+        <w:t xml:space="preserve"> </w:t>
+      </w:r>
+      <w:r>
+        <w:t>this</w:t>
+      </w:r>
+      <w:r>
+        <w:t xml:space="preserve"> study answers the question:</w:t>
+      </w:r>
+    </w:p>
+    <w:p>
+      <w:pPr>
+        <w:rPr>
+          <w:b/>
+          <w:bCs/>
+        </w:rPr>
+      </w:pPr>
+      <w:r>
+        <w:rPr>
+          <w:b/>
+          <w:bCs/>
+        </w:rPr>
+        <w:t>Can Artificial Intelligence be used to reliably detect and track soccer players, goalkeepers, balls,</w:t>
+      </w:r>
+      <w:r>
+        <w:rPr>
+          <w:b/>
+          <w:bCs/>
+        </w:rPr>
+        <w:t xml:space="preserve"> and referees </w:t>
+      </w:r>
+      <w:r>
+        <w:rPr>
+          <w:b/>
+          <w:bCs/>
+        </w:rPr>
+        <w:t>using a single</w:t>
+      </w:r>
+      <w:r>
+        <w:rPr>
+          <w:b/>
+          <w:bCs/>
+        </w:rPr>
+        <w:t xml:space="preserve"> broadcast </w:t>
+      </w:r>
+      <w:r>
+        <w:rPr>
+          <w:b/>
+          <w:bCs/>
+        </w:rPr>
+        <w:t>camera</w:t>
+      </w:r>
+      <w:r>
+        <w:rPr>
+          <w:b/>
+          <w:bCs/>
+        </w:rPr>
+        <w:t>?</w:t>
+      </w:r>
+    </w:p>
+    <w:p>
+      <w:r>
+        <w:t>To address this question, we develop and evaluate an end-to-end computer vision pipeline for detecting and tracking key soccer entities from broadcast video. By applying a modern object detection and tracking framework, this study assesses the feasibility and limitations of single-camera systems for scalable soccer analytics.</w:t>
+      </w:r>
+    </w:p>
+    <w:p>
+      <w:r>
+        <w:t>The remainder of the paper is structured as follows</w:t>
+      </w:r>
+      <w:r>
+        <w:t>. Section II</w:t>
+      </w:r>
+      <w:r>
+        <w:t xml:space="preserve"> reviews</w:t>
+      </w:r>
+      <w:r>
+        <w:t xml:space="preserve"> related work in</w:t>
+      </w:r>
+      <w:r>
+        <w:t xml:space="preserve"> prior research and industry applications</w:t>
+      </w:r>
+      <w:r>
+        <w:t>. Section III</w:t>
+      </w:r>
+      <w:r>
+        <w:t xml:space="preserve"> outlines</w:t>
+      </w:r>
+      <w:r>
+        <w:t xml:space="preserve"> the original contribution </w:t>
+      </w:r>
+      <w:r>
+        <w:t>of this study. Section IV describes</w:t>
+      </w:r>
+      <w:r>
+        <w:t xml:space="preserve"> the </w:t>
+      </w:r>
+      <w:r>
+        <w:t>m</w:t>
+      </w:r>
+      <w:r>
+        <w:t>ethodology</w:t>
+      </w:r>
+      <w:r>
+        <w:t xml:space="preserve"> </w:t>
+      </w:r>
+      <w:r>
+        <w:t>and processing pipeline</w:t>
+      </w:r>
+      <w:r>
+        <w:t>. Section V</w:t>
+      </w:r>
+      <w:r>
+        <w:t xml:space="preserve"> </w:t>
+      </w:r>
+      <w:r>
+        <w:t>presents the r</w:t>
+      </w:r>
+      <w:r>
+        <w:t xml:space="preserve">esults </w:t>
+      </w:r>
+      <w:r>
+        <w:t>and</w:t>
+      </w:r>
+      <w:r>
+        <w:t xml:space="preserve"> performance</w:t>
+      </w:r>
+      <w:r>
+        <w:t xml:space="preserve"> of the pipeline. Section VI</w:t>
+      </w:r>
+      <w:r>
+        <w:t xml:space="preserve"> </w:t>
+      </w:r>
+      <w:r>
+        <w:t>d</w:t>
+      </w:r>
+      <w:r>
+        <w:t>iscussion acknowledges</w:t>
+      </w:r>
+      <w:r>
+        <w:t xml:space="preserve"> the</w:t>
+      </w:r>
+      <w:r>
+        <w:t xml:space="preserve"> limitations and outlines future research directions</w:t>
+      </w:r>
+      <w:r>
+        <w:t>. Section VII</w:t>
+      </w:r>
+      <w:r>
+        <w:t xml:space="preserve"> </w:t>
+      </w:r>
+      <w:r>
+        <w:t>concludes the paper.</w:t>
+      </w:r>
+    </w:p>
+    <w:p>
+      <w:pPr>
+        <w:pStyle w:val="Heading1"/>
+      </w:pPr>
+      <w:r>
+        <w:t>Related Work</w:t>
+      </w:r>
+    </w:p>
+    <w:p>
+      <w:r>
+        <w:t xml:space="preserve">Research on the application of computer vision to soccer has grown in recent years, although the field remains relatively underdeveloped compared to other computer vision domains. Prior work has explored player detection, tracking, and event understanding in broadcast footage, including benchmark efforts such as </w:t>
       </w:r>
       <w:proofErr w:type="spellStart"/>
       <w:r>
+        <w:t>SoccerNet</w:t>
+      </w:r>
+      <w:proofErr w:type="spellEnd"/>
+      <w:r>
+        <w:t xml:space="preserve"> (Cioppa et al.) and early systems for player identification and tracking in sports video (Lu et al.; Thomas et al.). These studies highlight the unique challenges posed by soccer footage, including frequent occlusions, dense player interactions, and continuous camera motion.</w:t>
+      </w:r>
+    </w:p>
+    <w:p>
+      <w:r>
+        <w:t xml:space="preserve">One of the more comprehensive soccer-specific studies is by Theiner et al., who evaluated multiple detection and tracking architectures, including Faster R-CNN, </w:t>
+      </w:r>
+      <w:proofErr w:type="spellStart"/>
+      <w:r>
+        <w:t>FootAndBall</w:t>
+      </w:r>
+      <w:proofErr w:type="spellEnd"/>
+      <w:r>
+        <w:t xml:space="preserve">, and </w:t>
+      </w:r>
+      <w:proofErr w:type="spellStart"/>
+      <w:r>
+        <w:t>CenterTrack</w:t>
+      </w:r>
+      <w:proofErr w:type="spellEnd"/>
+      <w:r>
+        <w:t xml:space="preserve">. A key contribution of their work is the explicit consideration of broadcast-style camera movement, which reflects realistic match recording conditions. However, several of the architectures evaluated—particularly Faster R-CNN—have since been surpassed by </w:t>
+      </w:r>
+      <w:r>
+        <w:lastRenderedPageBreak/>
+        <w:t>more recent one-stage detectors such as YOLO in both inference speed and detection accuracy, limiting their suitability for real-time or large-scale analysis.</w:t>
+      </w:r>
+    </w:p>
+    <w:p>
+      <w:r>
+        <w:t xml:space="preserve">Another relevant contribution is by </w:t>
+      </w:r>
+      <w:proofErr w:type="spellStart"/>
+      <w:r>
+        <w:t>Markappa</w:t>
+      </w:r>
+      <w:proofErr w:type="spellEnd"/>
+      <w:r>
+        <w:t>, who presented an extensive overview of the evolution of the YOLO family of object detection models, highlighting architectural improvements across successive generations. While this work provides useful context on detector development, it primarily focuses on comparing YOLO variants rather than evaluating their performance within soccer-specific detection and tracking pipelines.</w:t>
+      </w:r>
+    </w:p>
+    <w:p>
+      <w:r>
+        <w:t xml:space="preserve">Beyond soccer-focused research, advances in multi-object tracking (MOT) have strongly influenced modern tracking pipelines. Methods such as </w:t>
+      </w:r>
+      <w:proofErr w:type="spellStart"/>
+      <w:r>
+        <w:t>DeepSORT</w:t>
+      </w:r>
+      <w:proofErr w:type="spellEnd"/>
+      <w:r>
+        <w:t xml:space="preserve"> (</w:t>
+      </w:r>
+      <w:proofErr w:type="spellStart"/>
+      <w:r>
+        <w:t>Wojke</w:t>
+      </w:r>
+      <w:proofErr w:type="spellEnd"/>
+      <w:r>
+        <w:t xml:space="preserve"> et al.) and </w:t>
+      </w:r>
+      <w:proofErr w:type="spellStart"/>
+      <w:r>
         <w:t>ByteTrack</w:t>
       </w:r>
       <w:proofErr w:type="spellEnd"/>
       <w:r>
-        <w:t xml:space="preserve"> tracking algorithm to identify and track players, referees, goalkeepers, and the ball across match frames. The model was trained on a custom dataset containing professional broadcast footage as well as additional gameplay recordings.</w:t>
-      </w:r>
-    </w:p>
-    <w:p>
-      <w:r>
-        <w:t xml:space="preserve">Results show that the pipeline achieves high performance in detecting players and officials, with strong precision, recall, and </w:t>
+        <w:t xml:space="preserve"> (Zhang et al.) introduced robust identity association strategies that perform well under occlusion and camera motion, conditions commonly observed in broadcast sports footage. These approaches form the foundation of many contemporary tracking systems applied across domains.</w:t>
+      </w:r>
+    </w:p>
+    <w:p>
+      <w:r>
+        <w:t>Together, these works demonstrate both the promise and limitations of existing approaches. Prior research has either emphasized realistic video conditions using older detection architectures or focused on general detector evolution without domain-specific evaluation. As a result, there remains a gap in understanding how modern, lightweight object detectors perform across different soccer-specific object classes—particularly when constrained to single-camera broadcast footage. This study seeks to address that gap by evaluating a contemporary detection and tracking pipeline tailored to soccer analysis and by examining performance differences across players, referees, goalkeepers, and the ball.</w:t>
+      </w:r>
+    </w:p>
+    <w:p>
+      <w:pPr>
+        <w:pStyle w:val="Heading1"/>
+      </w:pPr>
+      <w:r>
+        <w:t>Original Contributions</w:t>
+      </w:r>
+    </w:p>
+    <w:p>
+      <w:r>
+        <w:t>Compared to prior research, this study builds upon foundational work in soccer computer vision while advancing the methodology through the application of a modern YOLO detector. A central contribution is the empirical evaluation of detection performance across individual classes—players, referees, goalkeepers, and the ball—rather than treating all objects uniformly. Such class-specific analysis is particularly important given the limited prior work in soccer-focused computer vision and the varying difficulty of detecting different entities in broadcast footage.</w:t>
+      </w:r>
+    </w:p>
+    <w:p>
+      <w:r>
+        <w:t xml:space="preserve">To the best of our knowledge, no existing study has applied YOLOv8 to soccer footage while providing detailed, class-level performance benchmarks. By reporting metrics separately for each object type, this work establishes a more granular baseline for future research and </w:t>
+      </w:r>
+      <w:r>
+        <w:lastRenderedPageBreak/>
+        <w:t>practical applications in sports analytics, offering insights into where modern detectors perform well and where further improvements are needed.</w:t>
+      </w:r>
+    </w:p>
+    <w:p>
+      <w:pPr>
+        <w:pStyle w:val="Heading1"/>
+      </w:pPr>
+      <w:r>
+        <w:t>Methodology</w:t>
+      </w:r>
+    </w:p>
+    <w:p>
+      <w:pPr>
+        <w:pStyle w:val="Subtitle"/>
+      </w:pPr>
+      <w:r>
+        <w:t>Overall Pipeline</w:t>
+      </w:r>
+    </w:p>
+    <w:p>
+      <w:r>
+        <w:t>The overall approach of this study consists of a multi-stage computer vision pipeline designed to detect and track players, referees, goalkeepers, and the ball in soccer match broadcast footage. Broadcast video serves as the input to the pipeline and is decomposed into individual frames. To reduce computational cost while preserving temporal continuity, frames are sampled using a stride of 30, corresponding to approximately one frame per second for standard broadcast footage.</w:t>
+      </w:r>
+    </w:p>
+    <w:p>
+      <w:r>
+        <w:t xml:space="preserve">Each sampled frame is processed using the YOLOv8s object detection model to localize the soccer players, </w:t>
+      </w:r>
+      <w:r>
+        <w:t>goalkeepers, referees, and ball;</w:t>
+      </w:r>
+      <w:r>
+        <w:t xml:space="preserve"> and generate axis-aligned bounding boxes in </w:t>
       </w:r>
       <w:proofErr w:type="spellStart"/>
       <w:r>
-        <w:t>mAP</w:t>
+        <w:t>xyxy</w:t>
       </w:r>
       <w:proofErr w:type="spellEnd"/>
       <w:r>
-        <w:t xml:space="preserve"> scores across most classes. Ball detection remains the primary challenge due to its small size, rapid movement, and frequent occlusion. Despite this limitation, the findings demonstrate that AI can reliably extract player-level spatial information from a single broadcast camera.</w:t>
-      </w:r>
-    </w:p>
-    <w:p>
-      <w:r>
-        <w:t>This work highlights the potential for affordable, scalable computer vision systems in soccer analytics. By reducing the reliance on specialized hardware, the proposed approach opens the door for colleges, academies, and amateur clubs to adopt data-driven methods traditionally accessible only to professional teams.</w:t>
-      </w:r>
-    </w:p>
-    <w:p>
-      <w:pPr>
-        <w:pStyle w:val="Heading1"/>
-      </w:pPr>
-      <w:r>
-        <w:t>Introduction</w:t>
-      </w:r>
-    </w:p>
-    <w:p>
-      <w:r>
-        <w:t xml:space="preserve">The topic of this paper is the application of computer vision in soccer. While the sport itself is known by different names—soccer in North America and football in most other parts of the world—the global conversation around the game is evolving rapidly, especially with North America set to host the 2026 World Cup. Beyond debates about terminology, new discussions are emerging around the role of artificial intelligence in soccer. Clubs that </w:t>
-      </w:r>
+        <w:t xml:space="preserve"> </w:t>
+      </w:r>
+      <w:r>
+        <w:t>format. Detected objects are subsequently cropped from the frame and encoded using the CLIP image encoder to obtain fixed-dimensional appearance embeddings. The CLIP transformer is used as a feature extractor to generate semantic representations of object appearances, producing embedding vectors of dimension 512.</w:t>
+      </w:r>
+    </w:p>
+    <w:p>
+      <w:r>
+        <w:t xml:space="preserve">To facilitate clustering and visualization, the high-dimensional CLIP embeddings are projected into a three-dimensional latent space using UMAP. The resulting low-dimensional representations are then clustered using K-Means to assign players to their respective teams based on </w:t>
+      </w:r>
+      <w:r>
+        <w:t>their jersey colors</w:t>
+      </w:r>
+      <w:r>
+        <w:t>.</w:t>
+      </w:r>
+    </w:p>
+    <w:p>
+      <w:r>
+        <w:t xml:space="preserve">Object identities are maintained across frames using </w:t>
+      </w:r>
+      <w:proofErr w:type="spellStart"/>
+      <w:r>
+        <w:t>ByteTrack</w:t>
+      </w:r>
+      <w:proofErr w:type="spellEnd"/>
+      <w:r>
+        <w:t>, which associates detections over time and assigns consistent unique identifiers to tracked entities. The integration of detection, appearance-based embedding extraction, dimensionality reduction, clustering, and tracking enables not only robust object detection and tracking but also team-level segmentation for downstream analysis.</w:t>
+      </w:r>
+    </w:p>
+    <w:p>
+      <w:pPr>
+        <w:pStyle w:val="Subtitle"/>
+      </w:pPr>
+      <w:r>
+        <w:t>Data</w:t>
+      </w:r>
+    </w:p>
+    <w:p>
+      <w:r>
+        <w:t xml:space="preserve">The dataset used in this study was a custom collection from </w:t>
+      </w:r>
+      <w:proofErr w:type="spellStart"/>
+      <w:r>
+        <w:t>Roboflow</w:t>
+      </w:r>
+      <w:proofErr w:type="spellEnd"/>
+      <w:r>
+        <w:t>, which included annotated broadcast footage from the German Bundesliga. To increase diversity in camera angles, lighting, and skill levels, I supplemented this footage with match recordings from NCAA Division I and UPSL matches. Combining professional and semi-professional footage allowed the model to generalize more effectively across different contexts.</w:t>
+      </w:r>
+    </w:p>
+    <w:p>
+      <w:pPr>
+        <w:pStyle w:val="Subtitle"/>
+      </w:pPr>
+      <w:r>
+        <w:t>Data Preprocessing</w:t>
+      </w:r>
+    </w:p>
+    <w:p>
       <w:r>
         <w:lastRenderedPageBreak/>
-        <w:t>adopted data analytics early have already demonstrated its competitive value, inspiring others to follow.</w:t>
-      </w:r>
-    </w:p>
-    <w:p>
-      <w:r>
-        <w:t>One of the most notable examples is Brighton &amp; Hove Albion. Their analytics-driven recruitment strategy has produced multiple high-profile successes: Moisés Caicedo was purchased for £4 million and later sold for £115 million; Alexis Mac Allister joined for £6.9 million and was sold for £35 million; Kaoru Mitoma arrived for £2.6 million and is now valued above £50 million</w:t>
-      </w:r>
-      <w:r>
-        <w:t xml:space="preserve"> (</w:t>
-      </w:r>
-      <w:r>
-        <w:t>Transfermarkt</w:t>
-      </w:r>
-      <w:r>
-        <w:t>)</w:t>
-      </w:r>
-      <w:r>
-        <w:t>. These are not isolated cases but indicators of a systematic, data-informed process. Brighton’s Technical Director, David Weir, highlighted this advantage when he said that the club is “fortunate to have access to all the information from every league in the world, which you’d never be able to cover on a scouting, subjective, eyes-on basis.”</w:t>
-      </w:r>
-      <w:r>
-        <w:t>(</w:t>
-      </w:r>
-      <w:r>
-        <w:t>Kershaw</w:t>
-      </w:r>
-      <w:r>
-        <w:t>)</w:t>
-      </w:r>
-      <w:r>
-        <w:t xml:space="preserve"> Analytics have contributed significantly to Brighton becoming one of the most profitable clubs in the Premier League during the period from 2019 to 2023 (Swiss Ramble).</w:t>
-      </w:r>
-    </w:p>
-    <w:p>
-      <w:r>
-        <w:t>This context demonstrates why the integration of data and AI is transformative. However, data does not appear by itself. As Weir implied, it is impossible for scouts to watch every player across every league and extract meaningful insights manually. Computer vision offers a scalable solution: it allows clubs to construct pipelines that automatically extract player, ball, and event information from raw match footage. This paper focuses on that foundational step.</w:t>
-      </w:r>
-    </w:p>
-    <w:p>
-      <w:r>
-        <w:t>The research problem addressed here is twofold. First, automatic data extraction begins with accurately detecting and tracking all key entities on the pitch: players, goalkeepers, referees, and the ball. The question is whether modern AI models can achieve this reliably. Second, soccer analytics often require coordinate and event data, yet many clubs lack GPS-based tracking systems. This raises another question: can coordinate data be captured reliably from broadcast or match footage using computer vision?</w:t>
-      </w:r>
-    </w:p>
-    <w:p>
-      <w:r>
-        <w:t>Although AI applications in sports are growing, computer vision in soccer remains relatively new, and rapid advances in machine learning make earlier studies quickly outdated. Many prior works rely on older architectures such as RNNs or Faster R-CNN. In contrast, newer real-time detection models like YOLO have demonstrated superior performance and efficiency but have not yet been widely evaluated in this specific context.</w:t>
-      </w:r>
-    </w:p>
-    <w:p>
-      <w:r>
-        <w:t xml:space="preserve">This paper contributes to the current body of research by applying an up-to-date methodology using a modern object detection model to evaluate how effectively players and other key entities can be detected in soccer footage. The approach involved splitting raw match video into individual frames and processing them using two models: an object detection model to identify players, referees, goalkeepers, and the ball, and a pitch </w:t>
-      </w:r>
-      <w:proofErr w:type="spellStart"/>
-      <w:r>
-        <w:lastRenderedPageBreak/>
-        <w:t>keypoint</w:t>
-      </w:r>
-      <w:proofErr w:type="spellEnd"/>
-      <w:r>
-        <w:t xml:space="preserve"> detection model to support future coordinate extraction. This paper focuses primarily on the object detection component.</w:t>
+        <w:t>Before training, all raw videos were split into frames at a consistent frame rate. Each frame was resized and normalized according to YOLO’s preprocessing standards. Additional augmentations such as horizontal flipping, rotation, brightness changes, and random cropping were applied to increase robustness to broadcast variations. All images were converted to RGB and scaled to the chosen input size of 1280×1280 pixels to ensure finer granularity when detecting small objects such as the ball.</w:t>
+      </w:r>
+    </w:p>
+    <w:p>
+      <w:r>
+        <w:t>Videos were decomposed into individual frames at their native frame rate. To reduce computational overhead while maintaining temporal coverage, frames were sampled using a stride of 30, corresponding to approximately one frame per second for standard broadcast footage.</w:t>
+      </w:r>
+    </w:p>
+    <w:p>
+      <w:r>
+        <w:t>Each sampled frame was resized and normalized according to YOLOv8 preprocessing standards. All images were converted to RGB and scaled to an input resolution of 1280 × 1280 pixels to preserve fine-grained spatial details, particularly for small objects such as the ball. No additional data augmentation was applied, as pretrained detection weights were used and all processing was performed at inference time.</w:t>
+      </w:r>
+    </w:p>
+    <w:p>
+      <w:pPr>
+        <w:pStyle w:val="Subtitle"/>
+      </w:pPr>
+      <w:r>
+        <w:t>Model Architecture</w:t>
+      </w:r>
+    </w:p>
+    <w:p>
+      <w:r>
+        <w:t>The detection architecture used was the YOLOv8s model. Although training initially began with the YOLOv8x variant, hardware constraints—including GPU memory limitations—made the larger model impractical. YOLOv8s provided an optimal balance between computational efficiency and performance.</w:t>
+      </w:r>
+    </w:p>
+    <w:p>
+      <w:r>
+        <w:t xml:space="preserve">The model </w:t>
+      </w:r>
+      <w:r>
+        <w:t>takes</w:t>
+      </w:r>
+      <w:r>
+        <w:t xml:space="preserve"> raw RGB frames through an initial convolutional layer</w:t>
+      </w:r>
+      <w:r>
+        <w:t>,</w:t>
       </w:r>
       <w:r>
         <w:t xml:space="preserve"> </w:t>
       </w:r>
-    </w:p>
-    <w:p>
-      <w:r>
-        <w:t>The findings indicate that the model performs well in detecting players, referees, and goalkeepers, though detecting the ball remains challenging due to its small size, speed, and frequent occlusion.</w:t>
-      </w:r>
-    </w:p>
-    <w:p>
-      <w:r>
-        <w:t>The remainder of the paper is structured as follows: the Related Work section reviews prior research and industry applications; the Methodology section describes the models and processing pipeline; the Results section presents detection performance; the Discussion section interprets the findings, acknowledges limitations, and outlines future research directions; and the Conclusion summarizes the study’s contributions.</w:t>
-      </w:r>
-    </w:p>
-    <w:p>
-      <w:pPr>
-        <w:pStyle w:val="Heading1"/>
-      </w:pPr>
-      <w:r>
-        <w:t>Related Work</w:t>
-      </w:r>
-    </w:p>
-    <w:p>
-      <w:r>
-        <w:t xml:space="preserve">Research on applying computer vision to soccer has grown significantly in recent years, though the field is still in its early stages. Several major approaches have been explored to detect, track, and analyze players and events in match footage. One of the more comprehensive works is by Jonas Theiner et al., who experimented with Faster R-CNN, </w:t>
-      </w:r>
-      <w:proofErr w:type="spellStart"/>
-      <w:r>
-        <w:t>FootAndBall</w:t>
-      </w:r>
-      <w:proofErr w:type="spellEnd"/>
-      <w:r>
-        <w:t xml:space="preserve">, and </w:t>
-      </w:r>
-      <w:proofErr w:type="spellStart"/>
-      <w:r>
-        <w:t>CenterTrack</w:t>
-      </w:r>
-      <w:proofErr w:type="spellEnd"/>
-      <w:r>
-        <w:t xml:space="preserve"> to detect and track players from broadcast video. Their methodology notably considered various camera angles, incorporating the dynamic nature of broadcast footage into their tracking pipeline. Another relevant contribution is by </w:t>
-      </w:r>
-      <w:proofErr w:type="spellStart"/>
-      <w:r>
-        <w:t>Markappa</w:t>
-      </w:r>
-      <w:proofErr w:type="spellEnd"/>
-      <w:r>
-        <w:t>, who presented an extensive discussion on the evolution of the YOLO family of object detectors and highlighted the improvements across YOLO generations. However, the paper did not specifically analyze performance across different object classes, leaving room to explore how modern models behave on players, referees, and the ball.</w:t>
-      </w:r>
-    </w:p>
-    <w:p>
-      <w:r>
-        <w:t xml:space="preserve">In terms of foundational or influential work, both Theiner et al. and </w:t>
-      </w:r>
-      <w:proofErr w:type="spellStart"/>
-      <w:r>
-        <w:t>Markappa</w:t>
-      </w:r>
-      <w:proofErr w:type="spellEnd"/>
-      <w:r>
-        <w:t xml:space="preserve"> provide valuable insights. Theiner’s work is influential for its attention to real-world broadcast conditions, while </w:t>
-      </w:r>
-      <w:proofErr w:type="spellStart"/>
-      <w:r>
-        <w:t>Markappa’s</w:t>
-      </w:r>
-      <w:proofErr w:type="spellEnd"/>
-      <w:r>
-        <w:t xml:space="preserve"> overview of YOLO’s development offers important context for understanding how modern detectors emerged. Still, because computer vision in soccer is a relatively new application area, the field lacks a large body of standardized, widely cited literature. Research produced even a few years ago can quickly become outdated as newer, more efficient architectures are introduced.</w:t>
-      </w:r>
-    </w:p>
-    <w:p>
-      <w:r>
-        <w:t xml:space="preserve">A significant challenge in this domain is the lack of publicly available datasets. Unlike fields such as pedestrian detection or autonomous driving—where large, labeled datasets exist—soccer video datasets are scarce. Many professional clubs maintain private internal datasets generated by in-house analytics teams, but these are rarely shared publicly. As a </w:t>
-      </w:r>
-      <w:r>
-        <w:lastRenderedPageBreak/>
-        <w:t>result, academic research often relies on small, custom-created datasets, making replication and benchmarking more difficult.</w:t>
-      </w:r>
-    </w:p>
-    <w:p>
-      <w:r>
-        <w:t xml:space="preserve">Existing approaches provide several strengths. Theiner et al.’s work is valuable because it recognizes the complexities of multi-camera broadcast footage and accounts for camera transitions. </w:t>
-      </w:r>
-      <w:proofErr w:type="spellStart"/>
-      <w:r>
-        <w:t>Markappa’s</w:t>
-      </w:r>
-      <w:proofErr w:type="spellEnd"/>
-      <w:r>
-        <w:t xml:space="preserve"> analysis contributes by clearly outlining the capabilities of different YOLO versions and how they improve upon earlier architectures</w:t>
-      </w:r>
-      <w:r>
-        <w:t xml:space="preserve">. </w:t>
-      </w:r>
-      <w:r>
-        <w:t xml:space="preserve">However, these works also have limitations. Theiner et al. rely on architectures such as Faster R-CNN that have since been surpassed by more modern models like YOLO in both speed and accuracy. </w:t>
-      </w:r>
-      <w:proofErr w:type="spellStart"/>
-      <w:r>
-        <w:t>Markappa’s</w:t>
-      </w:r>
-      <w:proofErr w:type="spellEnd"/>
-      <w:r>
-        <w:t xml:space="preserve"> work, while useful as an overview, focuses primarily on comparing YOLO variants rather than applying them to optimize real-world performance in soccer-specific contexts.</w:t>
-      </w:r>
-    </w:p>
-    <w:p>
-      <w:r>
-        <w:t xml:space="preserve">Compared to prior research, this study builds upon the foundational ideas introduced by these works while advancing the methodology </w:t>
-      </w:r>
-      <w:proofErr w:type="gramStart"/>
-      <w:r>
-        <w:t>through the use of</w:t>
-      </w:r>
-      <w:proofErr w:type="gramEnd"/>
-      <w:r>
-        <w:t xml:space="preserve"> a modern YOLO model. My work examines the performance of YOLO not only as a general detector but specifically across individual classes—players, referees, goalkeepers, and the ball. Additionally, this study incorporates a </w:t>
-      </w:r>
-      <w:proofErr w:type="spellStart"/>
-      <w:r>
-        <w:t>keypoint</w:t>
-      </w:r>
-      <w:proofErr w:type="spellEnd"/>
-      <w:r>
-        <w:t xml:space="preserve"> pitch detection model capable of identifying 32 field landmarks, enabling future research on coordinate extraction and event mapping.</w:t>
-      </w:r>
-      <w:r>
-        <w:t xml:space="preserve"> </w:t>
-      </w:r>
-      <w:r>
-        <w:t xml:space="preserve">This contribution is necessary because soccer-focused computer vision research remains limited. To the best of my knowledge, no existing work has applied the most recent YOLO models to soccer footage while evaluating class-specific performance in detail. By providing updated benchmarks and integrating pitch </w:t>
-      </w:r>
-      <w:proofErr w:type="spellStart"/>
-      <w:r>
-        <w:t>keypoint</w:t>
-      </w:r>
-      <w:proofErr w:type="spellEnd"/>
-      <w:r>
-        <w:t xml:space="preserve"> detection, this study helps move the conversation forward by establishing a stronger baseline for future research and practical applications in sports analytics.</w:t>
-      </w:r>
-    </w:p>
-    <w:p>
-      <w:r>
-        <w:t>Overall, the field is evolving rapidly. Advances in deep learning over the past decade—moving from RNN-based detectors to Faster R-CNN and now to real-time architectures like YOLO—reflect a broader trend toward models that are both faster and more accurate. As computer vision continues to improve, its adoption in soccer analytics is likely to grow, enabling more advanced tracking, event detection, and automated analysis tools.</w:t>
-      </w:r>
-    </w:p>
-    <w:p>
-      <w:pPr>
-        <w:pStyle w:val="Heading1"/>
-      </w:pPr>
-      <w:r>
-        <w:t>Methodology</w:t>
-      </w:r>
-    </w:p>
-    <w:p>
-      <w:pPr>
-        <w:pStyle w:val="Subtitle"/>
-      </w:pPr>
-      <w:r>
-        <w:t>Overall Pipeline</w:t>
-      </w:r>
-    </w:p>
-    <w:p>
-      <w:r>
-        <w:t xml:space="preserve">The overall approach of this study consists of a multi-stage computer vision pipeline designed to detect, track, and analyze players, referees, goalkeepers, and the ball from broadcast soccer footage. Raw video was first decomposed into individual frames. Each frame was processed by two separate models: (1) an object detection model based on </w:t>
-      </w:r>
-      <w:r>
-        <w:lastRenderedPageBreak/>
-        <w:t xml:space="preserve">YOLOv8s to identify players and other objects, and (2) a </w:t>
-      </w:r>
-      <w:proofErr w:type="spellStart"/>
-      <w:r>
-        <w:t>keypoint</w:t>
-      </w:r>
-      <w:proofErr w:type="spellEnd"/>
-      <w:r>
-        <w:t xml:space="preserve">-based pitch detection model capable of locating 32 field landmarks. After object detection, detections were passed into </w:t>
-      </w:r>
-      <w:proofErr w:type="spellStart"/>
-      <w:r>
-        <w:t>ByteTrack</w:t>
-      </w:r>
-      <w:proofErr w:type="spellEnd"/>
-      <w:r>
-        <w:t xml:space="preserve"> to assign persistent unique IDs, enabling player tracking across consecutive frames. To separate players into their respective teams, I used embedding-based clustering</w:t>
-      </w:r>
-      <w:r>
-        <w:t>.</w:t>
-      </w:r>
-      <w:r>
-        <w:t xml:space="preserve"> </w:t>
-      </w:r>
-      <w:proofErr w:type="spellStart"/>
-      <w:r>
-        <w:t>SigLib</w:t>
-      </w:r>
-      <w:proofErr w:type="spellEnd"/>
-      <w:r>
-        <w:t xml:space="preserve"> was used to extract embeddings from each player’s cropped image, UMAP for dimensionality reduction, and </w:t>
-      </w:r>
-      <w:proofErr w:type="spellStart"/>
-      <w:r>
-        <w:t>KMeans</w:t>
-      </w:r>
-      <w:proofErr w:type="spellEnd"/>
-      <w:r>
-        <w:t xml:space="preserve"> to cluster the embeddings into two teams. This pipeline allowed not only detection and tracking but also team-level segmentation for downstream analysis.</w:t>
-      </w:r>
-    </w:p>
-    <w:p>
-      <w:pPr>
-        <w:pStyle w:val="Subtitle"/>
-      </w:pPr>
-      <w:r>
-        <w:t>Data</w:t>
-      </w:r>
-    </w:p>
-    <w:p>
-      <w:r>
-        <w:t xml:space="preserve">The dataset used in this study was a custom collection from </w:t>
-      </w:r>
-      <w:proofErr w:type="spellStart"/>
-      <w:r>
-        <w:t>Roboflow</w:t>
-      </w:r>
-      <w:proofErr w:type="spellEnd"/>
-      <w:r>
-        <w:t>, which included annotated broadcast footage from the German Bundesliga. To increase diversity in camera angles, lighting, and skill levels, I supplemented this footage with personal match recordings from my NCAA Division I and UPSL matches. Combining professional and semi-professional footage allowed the model to generalize more effectively across different contexts.</w:t>
-      </w:r>
-    </w:p>
-    <w:p>
-      <w:pPr>
-        <w:pStyle w:val="Subtitle"/>
-      </w:pPr>
-      <w:r>
-        <w:t>Data Preprocessing</w:t>
-      </w:r>
-    </w:p>
-    <w:p>
-      <w:r>
-        <w:t xml:space="preserve">Before training, all raw videos were split into frames at a consistent frame rate. Each frame was resized and normalized according to YOLO’s preprocessing standards. Bounding box annotations provided by </w:t>
-      </w:r>
-      <w:proofErr w:type="spellStart"/>
-      <w:r>
-        <w:t>Roboflow</w:t>
-      </w:r>
-      <w:proofErr w:type="spellEnd"/>
-      <w:r>
-        <w:t xml:space="preserve"> were converted into YOLO label format. Additional augmentations such as horizontal flipping, rotation, brightness changes, and random cropping were applied to increase robustness to broadcast variations. All images were converted to RGB and scaled to the chosen input size of 1280×1280 pixels to ensure finer granularity when detecting small objects such as the ball.</w:t>
-      </w:r>
-    </w:p>
-    <w:p>
-      <w:pPr>
-        <w:pStyle w:val="Subtitle"/>
-      </w:pPr>
-      <w:r>
-        <w:t>Model Architecture</w:t>
-      </w:r>
-    </w:p>
-    <w:p>
-      <w:r>
-        <w:t>The primary detection architecture used was the YOLOv8s model. Although training initially began with the YOLOv8x variant, hardware constraints—including GPU memory limitations—made the larger model impractical. YOLOv8s provided an optimal balance between computational efficiency and performance.</w:t>
-      </w:r>
-    </w:p>
-    <w:p>
-      <w:r>
-        <w:t>The model takes in raw RGB frames through an initial convolutional layer that converts the 3-channel image into 32 feature maps. The backbone of the network contains 127 hidden layers composed of:</w:t>
+      <w:r>
+        <w:t>which</w:t>
+      </w:r>
+      <w:r>
+        <w:t xml:space="preserve"> converts the 3-channel image into 32 feature maps. The backbone of the network contains 127 hidden layers composed of:</w:t>
       </w:r>
     </w:p>
     <w:p>
@@ -426,7 +619,7 @@
         </w:numPr>
       </w:pPr>
       <w:r>
-        <w:t>Convolutional Layers — These form the basis of visual feature extraction, detecting edges, textures, patterns, and shapes.</w:t>
+        <w:t>Convolutional Layers — Convolutional layers extract low- and mid-level visual features from broadcast soccer footage, such as player silhouettes, jersey textures, field markings, and ball contours. These features provide the spatial foundation for distinguishing visually similar entities (e.g., opposing teams with similar kits) and for localizing small, fast-moving objects such as the ball under varying lighting and camera conditions.</w:t>
       </w:r>
     </w:p>
     <w:p>
@@ -438,8 +631,7 @@
         </w:numPr>
       </w:pPr>
       <w:r>
-        <w:lastRenderedPageBreak/>
-        <w:t>Batch Normalization + Activation Functions — These stabilize intermediate activations and introduce non-linearity, allowing the model to learn complex relationships.</w:t>
+        <w:t>Batch Normalization and Activation Functions — Batch normalization stabilizes intermediate feature distributions across varying lighting conditions, camera exposure changes, and broadcast quality, while nonlinear activation functions enable the network to model complex visual variations in player appearance, jersey textures, and background clutter. Together, these components improve robustness when detecting visually similar entities under dynamic match conditions.</w:t>
       </w:r>
     </w:p>
     <w:p>
@@ -451,7 +643,14 @@
         </w:numPr>
       </w:pPr>
       <w:r>
-        <w:t>C2f/CSP Blocks — Lightweight but expressive blocks designed for efficient deep feature extraction without unnecessary computational cost.</w:t>
+        <w:lastRenderedPageBreak/>
+        <w:t xml:space="preserve">C2f / Cross Stage Partial (CSP) Blocks — C2f and CSP blocks enable efficient deep feature extraction by partitioning and reusing feature maps, reducing redundancy while preserving representational capacity. This design is well-suited for </w:t>
+      </w:r>
+      <w:r>
+        <w:t xml:space="preserve">sports analytics because </w:t>
+      </w:r>
+      <w:r>
+        <w:t>multiple objects must be detected simultaneously without incurring excessive computational cost.</w:t>
       </w:r>
     </w:p>
     <w:p>
@@ -462,21 +661,35 @@
           <w:numId w:val="2"/>
         </w:numPr>
       </w:pPr>
-      <w:proofErr w:type="spellStart"/>
-      <w:r>
-        <w:t>Downsampling</w:t>
-      </w:r>
-      <w:proofErr w:type="spellEnd"/>
-      <w:r>
-        <w:t xml:space="preserve"> and </w:t>
-      </w:r>
-      <w:proofErr w:type="spellStart"/>
-      <w:r>
-        <w:t>Upsampling</w:t>
-      </w:r>
-      <w:proofErr w:type="spellEnd"/>
-      <w:r>
-        <w:t xml:space="preserve"> Layers — These enable multi-scale feature learning, allowing the model to detect large and small objects (e.g., full players vs. the ball).</w:t>
+      <w:r>
+        <w:t>Down</w:t>
+      </w:r>
+      <w:r>
+        <w:t>-</w:t>
+      </w:r>
+      <w:r>
+        <w:t>sampling and Up</w:t>
+      </w:r>
+      <w:r>
+        <w:t>-</w:t>
+      </w:r>
+      <w:r>
+        <w:t>sampling Layers — These layers facilitate multi-scale feature learning by aggregating contextual information at coarse resolutions and recovering spatial detail at finer scales. This is critical for soccer analysis</w:t>
+      </w:r>
+      <w:r>
+        <w:t xml:space="preserve"> because</w:t>
+      </w:r>
+      <w:r>
+        <w:t xml:space="preserve"> objects of interest vary significantly in size, ranging from full-body player detections to</w:t>
+      </w:r>
+      <w:r>
+        <w:t xml:space="preserve"> a</w:t>
+      </w:r>
+      <w:r>
+        <w:t xml:space="preserve"> small, fast-moving</w:t>
+      </w:r>
+      <w:r>
+        <w:t xml:space="preserve"> ball.</w:t>
       </w:r>
     </w:p>
     <w:p>
@@ -488,7 +701,7 @@
         </w:numPr>
       </w:pPr>
       <w:r>
-        <w:t>SPPF (Spatial Pyramid Pooling Fast) — This component captures global spatial context, improving the model’s ability to reason across varying camera distances.</w:t>
+        <w:t>Spatial Pyramid Pooling Fast (SPPF) — The SPPF module captures global spatial context by pooling features at multiple receptive field sizes, enabling the model to reason across varying camera zoom levels and field coverage. This global context improves detection performance when players appear at different scales due to camera distance or perspective changes.</w:t>
       </w:r>
     </w:p>
     <w:p>
@@ -500,7 +713,7 @@
         </w:numPr>
       </w:pPr>
       <w:r>
-        <w:t>Concatenation Layers — These fuse feature maps from different resolutions to enable holistic, multi-scale reasoning.</w:t>
+        <w:t>Concatenation Layers — Concatenation layers fuse feature maps from multiple resolution levels, combining fine-grained spatial details (e.g., jersey edges, limb boundaries, and the ball) with higher-level semantic context (e.g., full player body structure and field layout). This multi-scale fusion improves detection in crowded match situations such as set pieces, midfield congestion, and goalmouth scrambles, where players frequently overlap or are partially occluded in broadcast soccer footage.</w:t>
       </w:r>
     </w:p>
     <w:p>
@@ -512,12 +725,24 @@
         </w:numPr>
       </w:pPr>
       <w:r>
-        <w:t>Detection Head — The final layer outputs bounding boxes, class probabilities, and confidence scores.</w:t>
-      </w:r>
-    </w:p>
-    <w:p>
-      <w:r>
-        <w:t>Together, these components form an efficient end-to-end detection pipeline suited for real-time soccer analysis.</w:t>
+        <w:t xml:space="preserve">Detection Head — The detection head produces bounding box coordinates, class probabilities, and confidence scores for each detected entity. In this work, these outputs serve as the basis for downstream </w:t>
+      </w:r>
+      <w:r>
+        <w:t xml:space="preserve">tasks, including </w:t>
+      </w:r>
+      <w:r>
+        <w:t xml:space="preserve">cropping, appearance embedding extraction, and temporal association, </w:t>
+      </w:r>
+      <w:r>
+        <w:t xml:space="preserve">thereby </w:t>
+      </w:r>
+      <w:r>
+        <w:t>enabling player tracking and team-level segmentation.</w:t>
+      </w:r>
+    </w:p>
+    <w:p>
+      <w:r>
+        <w:t>Together, these components form an efficient end-to-end detection pipeline optimized for soccer footage, enabling reliable object localization, temporal tracking, and downstream appearance-based analysis in real-world match settings.</w:t>
       </w:r>
     </w:p>
     <w:p>
@@ -530,33 +755,152 @@
     </w:p>
     <w:p>
       <w:r>
-        <w:t>To better detect small objects—specifically the ball—the input resolution was increased from the default 640×640 to 1280×1280 pixels. This higher resolution preserved finer spatial details and significantly improved ball visibility.</w:t>
+        <w:t>T</w:t>
+      </w:r>
+      <w:r>
+        <w:t>o better detect small objects—specifically the ball—the input resolution was increased from the default 640×640 to 1280×1280 pixels. This higher resolution preserved finer spatial details and significantly improved ball visibility.</w:t>
       </w:r>
       <w:r>
         <w:t xml:space="preserve"> </w:t>
       </w:r>
       <w:r>
-        <w:t>A batch size of 6 was selected to fit GPU memory constraints and accelerate training. Training ran for 25 epochs to reduce computational cost while still achieving convergence.</w:t>
+        <w:t xml:space="preserve">A batch size of 6 was selected to fit </w:t>
+      </w:r>
+      <w:r>
+        <w:t>C</w:t>
+      </w:r>
+      <w:r>
+        <w:t>PU memory constraints and accelerate training. Training ran for 25 epochs to</w:t>
+      </w:r>
+      <w:r>
+        <w:t xml:space="preserve"> keep</w:t>
+      </w:r>
+      <w:r>
+        <w:t xml:space="preserve"> computational cost</w:t>
+      </w:r>
+      <w:r>
+        <w:t xml:space="preserve"> minimal</w:t>
+      </w:r>
+      <w:r>
+        <w:t xml:space="preserve"> while still achieving convergence. </w:t>
+      </w:r>
+      <w:proofErr w:type="spellStart"/>
+      <w:r>
+        <w:t>AdamW</w:t>
+      </w:r>
+      <w:proofErr w:type="spellEnd"/>
+      <w:r>
+        <w:t xml:space="preserve"> was used to </w:t>
+      </w:r>
+      <w:r>
+        <w:lastRenderedPageBreak/>
+        <w:t>optimize the detector because its decoupled weight decay allowed</w:t>
       </w:r>
       <w:r>
         <w:t xml:space="preserve"> </w:t>
       </w:r>
       <w:r>
-        <w:t xml:space="preserve">The optimizer used was </w:t>
+        <w:t>train</w:t>
+      </w:r>
+      <w:r>
+        <w:t xml:space="preserve">ed </w:t>
+      </w:r>
+      <w:r>
+        <w:t>YOLOv8 representations to be preserved during fine-tuning, while still adapting effectively to the high-resolution soccer frames required for accurate player and ball localization.</w:t>
+      </w:r>
+      <w:r>
+        <w:t xml:space="preserve"> </w:t>
+      </w:r>
+      <w:r>
+        <w:t>T</w:t>
+      </w:r>
+      <w:r>
+        <w:t xml:space="preserve">he object detection component was trained in this work. The YOLOv8 detector was fine-tuned </w:t>
+      </w:r>
+      <w:r>
+        <w:t>on</w:t>
+      </w:r>
+      <w:r>
+        <w:t xml:space="preserve"> pretrained weights, wh</w:t>
+      </w:r>
+      <w:r>
+        <w:t>ereas</w:t>
+      </w:r>
+      <w:r>
+        <w:t xml:space="preserve"> all other components—including CLIP, UMAP, K-Means, and </w:t>
       </w:r>
       <w:proofErr w:type="spellStart"/>
       <w:r>
-        <w:t>AdamW</w:t>
+        <w:t>ByteTrack</w:t>
       </w:r>
       <w:proofErr w:type="spellEnd"/>
       <w:r>
-        <w:t>, which is particularly effective for computer vision tasks because it decouples weight decay from gradient updates. This leads to more stable training, better generalization, and less overfitting—especially when using high-resolution inputs and relatively small datasets.</w:t>
+        <w:t xml:space="preserve">—were used without </w:t>
+      </w:r>
+      <w:r>
+        <w:t>further</w:t>
+      </w:r>
+      <w:r>
+        <w:t xml:space="preserve"> training.</w:t>
       </w:r>
       <w:r>
         <w:t xml:space="preserve"> </w:t>
       </w:r>
       <w:r>
-        <w:t>During training, I monitored three primary loss components:</w:t>
+        <w:t xml:space="preserve"> This led to more stable training, better generalization, and less overfitting—especially when using high-resolution inputs and relatively small datasets.</w:t>
+      </w:r>
+      <w:r>
+        <w:t xml:space="preserve"> </w:t>
+      </w:r>
+    </w:p>
+    <w:p>
+      <w:r>
+        <w:drawing>
+          <wp:inline distT="0" distB="0" distL="0" distR="0" wp14:anchorId="4B7329A9" wp14:editId="5E1F8BB1">
+            <wp:extent cx="5943600" cy="4716780"/>
+            <wp:effectExtent l="0" t="0" r="0" b="0"/>
+            <wp:docPr id="2097328947" name="Picture 1" descr="A group of graphs showing loss&#10;&#10;AI-generated content may be incorrect."/>
+            <wp:cNvGraphicFramePr>
+              <a:graphicFrameLocks xmlns:a="http://schemas.openxmlformats.org/drawingml/2006/main" noChangeAspect="1"/>
+            </wp:cNvGraphicFramePr>
+            <a:graphic xmlns:a="http://schemas.openxmlformats.org/drawingml/2006/main">
+              <a:graphicData uri="http://schemas.openxmlformats.org/drawingml/2006/picture">
+                <pic:pic xmlns:pic="http://schemas.openxmlformats.org/drawingml/2006/picture">
+                  <pic:nvPicPr>
+                    <pic:cNvPr id="2097328947" name="Picture 1" descr="A group of graphs showing loss&#10;&#10;AI-generated content may be incorrect."/>
+                    <pic:cNvPicPr/>
+                  </pic:nvPicPr>
+                  <pic:blipFill>
+                    <a:blip r:embed="rId5"/>
+                    <a:stretch>
+                      <a:fillRect/>
+                    </a:stretch>
+                  </pic:blipFill>
+                  <pic:spPr>
+                    <a:xfrm>
+                      <a:off x="0" y="0"/>
+                      <a:ext cx="5943600" cy="4716780"/>
+                    </a:xfrm>
+                    <a:prstGeom prst="rect">
+                      <a:avLst/>
+                    </a:prstGeom>
+                  </pic:spPr>
+                </pic:pic>
+              </a:graphicData>
+            </a:graphic>
+          </wp:inline>
+        </w:drawing>
+      </w:r>
+    </w:p>
+    <w:p>
+      <w:r>
+        <w:t>Training and validation loss curves for all three loss components decreased steadily throughout training, indicating stable convergence. Validation losses closely tracked training losses, suggesting that the model learned robust features without significant overfitting. Although both training and validation losses continued to trend downward at the end of training, the model was trained for 25 epochs due to computational and time constraints.</w:t>
+      </w:r>
+    </w:p>
+    <w:p>
+      <w:r>
+        <w:lastRenderedPageBreak/>
+        <w:t>Moreover, three primary loss components were closely monitored during training, each tied to the unique challenges within soccer analytics:</w:t>
       </w:r>
     </w:p>
     <w:p>
@@ -564,11 +908,11 @@
         <w:pStyle w:val="ListParagraph"/>
         <w:numPr>
           <w:ilvl w:val="0"/>
-          <w:numId w:val="3"/>
+          <w:numId w:val="4"/>
         </w:numPr>
       </w:pPr>
       <w:r>
-        <w:t>Box Loss — Measures how accurately the predicted bounding boxes align with ground truth.</w:t>
+        <w:t>Box Loss — Quantifies how accurately predicted bounding boxes match ground truth, which is critical for precisely localizing players in crowded midfield scrums, goalkeepers in the penalty area, and the fast-moving ball during open play.</w:t>
       </w:r>
     </w:p>
     <w:p>
@@ -576,11 +920,11 @@
         <w:pStyle w:val="ListParagraph"/>
         <w:numPr>
           <w:ilvl w:val="0"/>
-          <w:numId w:val="3"/>
+          <w:numId w:val="4"/>
         </w:numPr>
       </w:pPr>
       <w:r>
-        <w:t>Classification Loss — Measures how well the model classifies players, referees, goalkeepers, and the ball.</w:t>
+        <w:t>Classification Loss — Measures how well the model distinguishes between visually similar entities such as players from opposing teams, referees, and goalkeepers, ensuring that team assignments and role-specific analysis remain reliable.</w:t>
       </w:r>
     </w:p>
     <w:p>
@@ -588,16 +932,16 @@
         <w:pStyle w:val="ListParagraph"/>
         <w:numPr>
           <w:ilvl w:val="0"/>
-          <w:numId w:val="3"/>
+          <w:numId w:val="4"/>
         </w:numPr>
       </w:pPr>
       <w:r>
-        <w:t>Distribution Focal Loss (DFL) — Helps the model better localize objects by predicting a more precise distribution of bounding box edges.</w:t>
-      </w:r>
-    </w:p>
-    <w:p>
-      <w:r>
-        <w:t>These combined losses provided a comprehensive assessment of the model’s learning progress.</w:t>
+        <w:t>Distribution Focal Loss (DFL) — Refines bounding box predictions by modeling a precise distribution of edge locations, helping the model capture small, fast-moving objects like the ball and tightly packed players near the goal.</w:t>
+      </w:r>
+    </w:p>
+    <w:p>
+      <w:r>
+        <w:t>Monitoring these losses together provided a comprehensive view of the model’s learning progress, ensuring accurate detection and tracking across the dynamic and crowded scenarios typical of broadcast soccer footage.</w:t>
       </w:r>
     </w:p>
     <w:p>
@@ -605,253 +949,974 @@
         <w:pStyle w:val="Subtitle"/>
       </w:pPr>
       <w:r>
+        <w:t>Evaluation Metrics</w:t>
+      </w:r>
+    </w:p>
+    <w:p>
+      <w:r>
+        <w:t xml:space="preserve">Model performance was evaluated using precision, recall, mAP@0.5, and mAP@0.5–0.95, with all metrics computed </w:t>
+      </w:r>
+      <w:r>
+        <w:t xml:space="preserve">as an overall and </w:t>
+      </w:r>
+      <w:r>
+        <w:t xml:space="preserve">separately for </w:t>
+      </w:r>
+      <w:r>
+        <w:t>each class</w:t>
+      </w:r>
+      <w:r>
+        <w:t>. Precision measured the proportion of correctly detected objects out of all predictions, reflecting the model’s ability to avoid false positives — for example, mistakenly labeling a referee as a player or confusing the ball with a player’s foot. Recall measured the fraction of real objects successfully detected, indicating how well the model captured fast-moving balls, overlapping players during corner kicks, or goalkeepers in the penalty area. mAP@0.5 assessed detection accuracy at an Intersection over Union (</w:t>
+      </w:r>
+      <w:proofErr w:type="spellStart"/>
+      <w:r>
+        <w:t>IoU</w:t>
+      </w:r>
+      <w:proofErr w:type="spellEnd"/>
+      <w:r>
+        <w:t xml:space="preserve">) threshold of 0.5, serving as </w:t>
+      </w:r>
+      <w:r>
+        <w:t>a key indicator</w:t>
+      </w:r>
+      <w:r>
+        <w:t xml:space="preserve"> for comparing models on soccer footage. mAP@0.5–0.95 calculated mean Average Precision across </w:t>
+      </w:r>
+      <w:proofErr w:type="spellStart"/>
+      <w:r>
+        <w:t>IoU</w:t>
+      </w:r>
+      <w:proofErr w:type="spellEnd"/>
+      <w:r>
+        <w:t xml:space="preserve"> thresholds from 0.5 to 0.95 in 0.05 increments, providing a nuanced view of detection quality, including challenging cases like small ball detections or tightly clustered players </w:t>
+      </w:r>
+      <w:r>
+        <w:t>in the middle of the field</w:t>
+      </w:r>
+      <w:r>
+        <w:t>. Together, these metrics provided a comprehensive evaluation of the model’s ability to detect and distinguish all relevant soccer objects under broadcast conditions.</w:t>
+      </w:r>
+    </w:p>
+    <w:p>
+      <w:pPr>
+        <w:pStyle w:val="Heading1"/>
+      </w:pPr>
+      <w:r>
         <w:lastRenderedPageBreak/>
-        <w:t>Evaluation Metrics</w:t>
-      </w:r>
-    </w:p>
-    <w:p>
-      <w:r>
-        <w:t>Model performance was evaluated using precision, recall, mAP50, and mAP50–95, the standard metrics for object detection.</w:t>
+        <w:t>Results</w:t>
+      </w:r>
+    </w:p>
+    <w:p>
+      <w:r>
+        <w:rPr>
+          <w:noProof/>
+        </w:rPr>
+        <w:drawing>
+          <wp:inline distT="0" distB="0" distL="0" distR="0" wp14:anchorId="2EF7D1B6" wp14:editId="74350EE7">
+            <wp:extent cx="5943600" cy="4457700"/>
+            <wp:effectExtent l="0" t="0" r="0" b="0"/>
+            <wp:docPr id="1213356640" name="Picture 1" descr="A blue squares with white text&#10;&#10;AI-generated content may be incorrect."/>
+            <wp:cNvGraphicFramePr>
+              <a:graphicFrameLocks xmlns:a="http://schemas.openxmlformats.org/drawingml/2006/main" noChangeAspect="1"/>
+            </wp:cNvGraphicFramePr>
+            <a:graphic xmlns:a="http://schemas.openxmlformats.org/drawingml/2006/main">
+              <a:graphicData uri="http://schemas.openxmlformats.org/drawingml/2006/picture">
+                <pic:pic xmlns:pic="http://schemas.openxmlformats.org/drawingml/2006/picture">
+                  <pic:nvPicPr>
+                    <pic:cNvPr id="1213356640" name="Picture 1" descr="A blue squares with white text&#10;&#10;AI-generated content may be incorrect."/>
+                    <pic:cNvPicPr/>
+                  </pic:nvPicPr>
+                  <pic:blipFill>
+                    <a:blip r:embed="rId6"/>
+                    <a:stretch>
+                      <a:fillRect/>
+                    </a:stretch>
+                  </pic:blipFill>
+                  <pic:spPr>
+                    <a:xfrm>
+                      <a:off x="0" y="0"/>
+                      <a:ext cx="5943600" cy="4457700"/>
+                    </a:xfrm>
+                    <a:prstGeom prst="rect">
+                      <a:avLst/>
+                    </a:prstGeom>
+                  </pic:spPr>
+                </pic:pic>
+              </a:graphicData>
+            </a:graphic>
+          </wp:inline>
+        </w:drawing>
+      </w:r>
+    </w:p>
+    <w:tbl>
+      <w:tblPr>
+        <w:tblStyle w:val="TableGrid"/>
+        <w:tblW w:w="0" w:type="auto"/>
+        <w:tblLook w:val="04A0" w:firstRow="1" w:lastRow="0" w:firstColumn="1" w:lastColumn="0" w:noHBand="0" w:noVBand="1"/>
+      </w:tblPr>
+      <w:tblGrid>
+        <w:gridCol w:w="1414"/>
+        <w:gridCol w:w="1319"/>
+        <w:gridCol w:w="1331"/>
+        <w:gridCol w:w="1329"/>
+        <w:gridCol w:w="1315"/>
+        <w:gridCol w:w="1319"/>
+        <w:gridCol w:w="1323"/>
+      </w:tblGrid>
+      <w:tr>
+        <w:tc>
+          <w:tcPr>
+            <w:tcW w:w="1335" w:type="dxa"/>
+          </w:tcPr>
+          <w:p>
+            <w:r>
+              <w:t>Class</w:t>
+            </w:r>
+          </w:p>
+        </w:tc>
+        <w:tc>
+          <w:tcPr>
+            <w:tcW w:w="1335" w:type="dxa"/>
+          </w:tcPr>
+          <w:p>
+            <w:r>
+              <w:t>Images</w:t>
+            </w:r>
+          </w:p>
+        </w:tc>
+        <w:tc>
+          <w:tcPr>
+            <w:tcW w:w="1336" w:type="dxa"/>
+          </w:tcPr>
+          <w:p>
+            <w:r>
+              <w:t>Instances</w:t>
+            </w:r>
+          </w:p>
+        </w:tc>
+        <w:tc>
+          <w:tcPr>
+            <w:tcW w:w="1336" w:type="dxa"/>
+          </w:tcPr>
+          <w:p>
+            <w:r>
+              <w:t>Precision</w:t>
+            </w:r>
+          </w:p>
+        </w:tc>
+        <w:tc>
+          <w:tcPr>
+            <w:tcW w:w="1336" w:type="dxa"/>
+          </w:tcPr>
+          <w:p>
+            <w:r>
+              <w:t>Recall</w:t>
+            </w:r>
+          </w:p>
+        </w:tc>
+        <w:tc>
+          <w:tcPr>
+            <w:tcW w:w="1336" w:type="dxa"/>
+          </w:tcPr>
+          <w:p>
+            <w:r>
+              <w:t>mAP50</w:t>
+            </w:r>
+          </w:p>
+        </w:tc>
+        <w:tc>
+          <w:tcPr>
+            <w:tcW w:w="1336" w:type="dxa"/>
+          </w:tcPr>
+          <w:p>
+            <w:r>
+              <w:t>mAP50-95</w:t>
+            </w:r>
+          </w:p>
+        </w:tc>
+      </w:tr>
+      <w:tr>
+        <w:tc>
+          <w:tcPr>
+            <w:tcW w:w="1335" w:type="dxa"/>
+          </w:tcPr>
+          <w:p>
+            <w:r>
+              <w:t>All</w:t>
+            </w:r>
+          </w:p>
+        </w:tc>
+        <w:tc>
+          <w:tcPr>
+            <w:tcW w:w="1335" w:type="dxa"/>
+          </w:tcPr>
+          <w:p>
+            <w:r>
+              <w:t>49</w:t>
+            </w:r>
+          </w:p>
+        </w:tc>
+        <w:tc>
+          <w:tcPr>
+            <w:tcW w:w="1336" w:type="dxa"/>
+          </w:tcPr>
+          <w:p>
+            <w:r>
+              <w:t>1174</w:t>
+            </w:r>
+          </w:p>
+        </w:tc>
+        <w:tc>
+          <w:tcPr>
+            <w:tcW w:w="1336" w:type="dxa"/>
+          </w:tcPr>
+          <w:p>
+            <w:r>
+              <w:t>0.884</w:t>
+            </w:r>
+          </w:p>
+        </w:tc>
+        <w:tc>
+          <w:tcPr>
+            <w:tcW w:w="1336" w:type="dxa"/>
+          </w:tcPr>
+          <w:p>
+            <w:r>
+              <w:t>0.828</w:t>
+            </w:r>
+          </w:p>
+        </w:tc>
+        <w:tc>
+          <w:tcPr>
+            <w:tcW w:w="1336" w:type="dxa"/>
+          </w:tcPr>
+          <w:p>
+            <w:r>
+              <w:t>0.871</w:t>
+            </w:r>
+          </w:p>
+        </w:tc>
+        <w:tc>
+          <w:tcPr>
+            <w:tcW w:w="1336" w:type="dxa"/>
+          </w:tcPr>
+          <w:p>
+            <w:r>
+              <w:t>0.583</w:t>
+            </w:r>
+          </w:p>
+        </w:tc>
+      </w:tr>
+      <w:tr>
+        <w:tc>
+          <w:tcPr>
+            <w:tcW w:w="1335" w:type="dxa"/>
+          </w:tcPr>
+          <w:p>
+            <w:r>
+              <w:t>Ball</w:t>
+            </w:r>
+          </w:p>
+        </w:tc>
+        <w:tc>
+          <w:tcPr>
+            <w:tcW w:w="1335" w:type="dxa"/>
+          </w:tcPr>
+          <w:p>
+            <w:r>
+              <w:t>45</w:t>
+            </w:r>
+          </w:p>
+        </w:tc>
+        <w:tc>
+          <w:tcPr>
+            <w:tcW w:w="1336" w:type="dxa"/>
+          </w:tcPr>
+          <w:p>
+            <w:r>
+              <w:t>45</w:t>
+            </w:r>
+          </w:p>
+        </w:tc>
+        <w:tc>
+          <w:tcPr>
+            <w:tcW w:w="1336" w:type="dxa"/>
+          </w:tcPr>
+          <w:p>
+            <w:r>
+              <w:t>0.914</w:t>
+            </w:r>
+          </w:p>
+        </w:tc>
+        <w:tc>
+          <w:tcPr>
+            <w:tcW w:w="1336" w:type="dxa"/>
+          </w:tcPr>
+          <w:p>
+            <w:r>
+              <w:t>0.511</w:t>
+            </w:r>
+          </w:p>
+        </w:tc>
+        <w:tc>
+          <w:tcPr>
+            <w:tcW w:w="1336" w:type="dxa"/>
+          </w:tcPr>
+          <w:p>
+            <w:r>
+              <w:t>0.616</w:t>
+            </w:r>
+          </w:p>
+        </w:tc>
+        <w:tc>
+          <w:tcPr>
+            <w:tcW w:w="1336" w:type="dxa"/>
+          </w:tcPr>
+          <w:p>
+            <w:r>
+              <w:t>0.296</w:t>
+            </w:r>
+          </w:p>
+        </w:tc>
+      </w:tr>
+      <w:tr>
+        <w:tc>
+          <w:tcPr>
+            <w:tcW w:w="1335" w:type="dxa"/>
+          </w:tcPr>
+          <w:p>
+            <w:r>
+              <w:t>Goalkeeper</w:t>
+            </w:r>
+          </w:p>
+        </w:tc>
+        <w:tc>
+          <w:tcPr>
+            <w:tcW w:w="1335" w:type="dxa"/>
+          </w:tcPr>
+          <w:p>
+            <w:r>
+              <w:t>38</w:t>
+            </w:r>
+          </w:p>
+        </w:tc>
+        <w:tc>
+          <w:tcPr>
+            <w:tcW w:w="1336" w:type="dxa"/>
+          </w:tcPr>
+          <w:p>
+            <w:r>
+              <w:t>39</w:t>
+            </w:r>
+          </w:p>
+        </w:tc>
+        <w:tc>
+          <w:tcPr>
+            <w:tcW w:w="1336" w:type="dxa"/>
+          </w:tcPr>
+          <w:p>
+            <w:r>
+              <w:t>0.801</w:t>
+            </w:r>
+          </w:p>
+        </w:tc>
+        <w:tc>
+          <w:tcPr>
+            <w:tcW w:w="1336" w:type="dxa"/>
+          </w:tcPr>
+          <w:p>
+            <w:r>
+              <w:t>0.897</w:t>
+            </w:r>
+          </w:p>
+        </w:tc>
+        <w:tc>
+          <w:tcPr>
+            <w:tcW w:w="1336" w:type="dxa"/>
+          </w:tcPr>
+          <w:p>
+            <w:r>
+              <w:t>0.931</w:t>
+            </w:r>
+          </w:p>
+        </w:tc>
+        <w:tc>
+          <w:tcPr>
+            <w:tcW w:w="1336" w:type="dxa"/>
+          </w:tcPr>
+          <w:p>
+            <w:r>
+              <w:t>0.659</w:t>
+            </w:r>
+          </w:p>
+        </w:tc>
+      </w:tr>
+      <w:tr>
+        <w:tc>
+          <w:tcPr>
+            <w:tcW w:w="1335" w:type="dxa"/>
+          </w:tcPr>
+          <w:p>
+            <w:r>
+              <w:t>Player</w:t>
+            </w:r>
+          </w:p>
+        </w:tc>
+        <w:tc>
+          <w:tcPr>
+            <w:tcW w:w="1335" w:type="dxa"/>
+          </w:tcPr>
+          <w:p>
+            <w:r>
+              <w:t>49</w:t>
+            </w:r>
+          </w:p>
+        </w:tc>
+        <w:tc>
+          <w:tcPr>
+            <w:tcW w:w="1336" w:type="dxa"/>
+          </w:tcPr>
+          <w:p>
+            <w:r>
+              <w:t>973</w:t>
+            </w:r>
+          </w:p>
+        </w:tc>
+        <w:tc>
+          <w:tcPr>
+            <w:tcW w:w="1336" w:type="dxa"/>
+          </w:tcPr>
+          <w:p>
+            <w:r>
+              <w:t>0.957</w:t>
+            </w:r>
+          </w:p>
+        </w:tc>
+        <w:tc>
+          <w:tcPr>
+            <w:tcW w:w="1336" w:type="dxa"/>
+          </w:tcPr>
+          <w:p>
+            <w:r>
+              <w:t>0.978</w:t>
+            </w:r>
+          </w:p>
+        </w:tc>
+        <w:tc>
+          <w:tcPr>
+            <w:tcW w:w="1336" w:type="dxa"/>
+          </w:tcPr>
+          <w:p>
+            <w:r>
+              <w:t>0.993</w:t>
+            </w:r>
+          </w:p>
+        </w:tc>
+        <w:tc>
+          <w:tcPr>
+            <w:tcW w:w="1336" w:type="dxa"/>
+          </w:tcPr>
+          <w:p>
+            <w:r>
+              <w:t>0.767</w:t>
+            </w:r>
+          </w:p>
+        </w:tc>
+      </w:tr>
+      <w:tr>
+        <w:tc>
+          <w:tcPr>
+            <w:tcW w:w="1335" w:type="dxa"/>
+          </w:tcPr>
+          <w:p>
+            <w:r>
+              <w:t>Referee</w:t>
+            </w:r>
+          </w:p>
+        </w:tc>
+        <w:tc>
+          <w:tcPr>
+            <w:tcW w:w="1335" w:type="dxa"/>
+          </w:tcPr>
+          <w:p>
+            <w:r>
+              <w:t>49</w:t>
+            </w:r>
+          </w:p>
+        </w:tc>
+        <w:tc>
+          <w:tcPr>
+            <w:tcW w:w="1336" w:type="dxa"/>
+          </w:tcPr>
+          <w:p>
+            <w:r>
+              <w:t>117</w:t>
+            </w:r>
+          </w:p>
+        </w:tc>
+        <w:tc>
+          <w:tcPr>
+            <w:tcW w:w="1336" w:type="dxa"/>
+          </w:tcPr>
+          <w:p>
+            <w:r>
+              <w:t>0.864</w:t>
+            </w:r>
+          </w:p>
+        </w:tc>
+        <w:tc>
+          <w:tcPr>
+            <w:tcW w:w="1336" w:type="dxa"/>
+          </w:tcPr>
+          <w:p>
+            <w:r>
+              <w:t>0.925</w:t>
+            </w:r>
+          </w:p>
+        </w:tc>
+        <w:tc>
+          <w:tcPr>
+            <w:tcW w:w="1336" w:type="dxa"/>
+          </w:tcPr>
+          <w:p>
+            <w:r>
+              <w:t>0.946</w:t>
+            </w:r>
+          </w:p>
+        </w:tc>
+        <w:tc>
+          <w:tcPr>
+            <w:tcW w:w="1336" w:type="dxa"/>
+          </w:tcPr>
+          <w:p>
+            <w:r>
+              <w:t>0.610</w:t>
+            </w:r>
+          </w:p>
+        </w:tc>
+      </w:tr>
+    </w:tbl>
+    <w:p/>
+    <w:p>
+      <w:r>
+        <w:t xml:space="preserve">Across all object classes, the model achieved strong overall performance, with an mAP@0.5 of 0.871 and balanced precision (0.884) and recall (0.828). This indicates reliable detection across </w:t>
+      </w:r>
+      <w:r>
+        <w:t>frames</w:t>
+      </w:r>
+      <w:r>
+        <w:t xml:space="preserve"> containing multiple object types simultaneously. The lower mAP@0.5–0.95 score reflects the increased difficulty of achieving very tight bounding box localization in crowded and dynamic match situations, particularly for small or partially occluded objects.</w:t>
+      </w:r>
+    </w:p>
+    <w:p>
+      <w:r>
+        <w:lastRenderedPageBreak/>
+        <w:t>Ball detection proved to be the most challenging task, with high precision (0.914) but substantially lower recall (0.511). This suggests that</w:t>
+      </w:r>
+      <w:r>
+        <w:t>,</w:t>
+      </w:r>
+      <w:r>
+        <w:t xml:space="preserve"> when the ball was detected, predictions were </w:t>
+      </w:r>
+      <w:r>
+        <w:t>gener</w:t>
+      </w:r>
+      <w:r>
+        <w:t xml:space="preserve">ally correct, but the model frequently </w:t>
+      </w:r>
+      <w:r>
+        <w:t>fail</w:t>
+      </w:r>
+      <w:r>
+        <w:t xml:space="preserve">ed </w:t>
+      </w:r>
+      <w:r>
+        <w:t>to</w:t>
       </w:r>
       <w:r>
         <w:t xml:space="preserve"> </w:t>
       </w:r>
       <w:r>
-        <w:t>Precision measured the proportion of correct detections out of all detections (i.e., low false positives).</w:t>
+        <w:t>detect</w:t>
+      </w:r>
+      <w:r>
+        <w:t xml:space="preserve"> the ball. This behavior is expected given the ball’s small size, rapid motion, and frequent occlusion by players’ feet, especially during fast transitions and crowded play. The reduced mAP@0.5–0.95 further highlights the difficulty of precise localization for such a small, fast-moving object</w:t>
+      </w:r>
+      <w:r>
+        <w:t>.</w:t>
+      </w:r>
+    </w:p>
+    <w:p>
+      <w:r>
+        <w:t>Goalkeeper detection achieved strong performance, with high recall (0.897) and an mAP@0.5 of 0.931. Despite a relatively small number of instances, the model effectively learned goalkeeper-specific visual cues such as distinct kits and consistent positioning near the goal area. The comparatively high mAP@0.5–0.95 indicates robust localization performance, even under</w:t>
+      </w:r>
+      <w:r>
+        <w:t xml:space="preserve"> moments where the box was crowded during corner kicks.</w:t>
+      </w:r>
+    </w:p>
+    <w:p>
+      <w:r>
+        <w:t xml:space="preserve">Player detection achieved the highest performance across all metrics, with precision (0.957), recall (0.978), and mAP@0.5 (0.993) all near saturation. This reflects the abundance of player instances in the dataset and the model’s ability to robustly detect players across a wide range of poses, camera distances, and in dense formations such as midfield play and set pieces. The strong mAP@0.5–0.95 score further indicates accurate localization even under stricter </w:t>
+      </w:r>
+      <w:proofErr w:type="spellStart"/>
+      <w:r>
+        <w:t>IoU</w:t>
+      </w:r>
+      <w:proofErr w:type="spellEnd"/>
+      <w:r>
+        <w:t xml:space="preserve"> thresholds.</w:t>
+      </w:r>
+    </w:p>
+    <w:p>
+      <w:r>
+        <w:t xml:space="preserve">Referee detection demonstrated strong performance, with high recall (0.925) and mAP@0.5 (0.946). While referees appear less frequently than players, their distinct uniforms and consistent movement patterns enabled reliable detection. Slightly lower precision suggests occasional confusion </w:t>
+      </w:r>
+      <w:r>
+        <w:t>between referees and</w:t>
+      </w:r>
+      <w:r>
+        <w:t xml:space="preserve"> player</w:t>
+      </w:r>
+      <w:r>
+        <w:t>s</w:t>
+      </w:r>
+      <w:r>
+        <w:t>, particularly in c</w:t>
+      </w:r>
+      <w:r>
+        <w:t>rowd</w:t>
+      </w:r>
+      <w:r>
+        <w:t xml:space="preserve">ed scenes, but overall results indicate effective </w:t>
+      </w:r>
+      <w:r>
+        <w:t>identification</w:t>
+      </w:r>
+      <w:r>
+        <w:t>.</w:t>
+      </w:r>
+    </w:p>
+    <w:p>
+      <w:pPr>
+        <w:pStyle w:val="Heading1"/>
+      </w:pPr>
+      <w:r>
+        <w:t>Discussion</w:t>
+      </w:r>
+    </w:p>
+    <w:p>
+      <w:r>
+        <w:t xml:space="preserve">Despite the overall strong performance, the results reveal several limitations. The most significant </w:t>
+      </w:r>
+      <w:r>
+        <w:t xml:space="preserve">difficulty </w:t>
+      </w:r>
+      <w:r>
+        <w:t xml:space="preserve">is </w:t>
+      </w:r>
+      <w:r>
+        <w:t>in</w:t>
+      </w:r>
+      <w:r>
+        <w:t xml:space="preserve"> accurately detecting the ball, particularly in crowded scenes or when the camera angle obscures the object. False positives sometimes occur when cleats or bald heads resemble the ball, and false negatives arise when the ball is occluded by players’ bodies. Additionally, the reliance on higher-resolution inputs (1280×1280) improves ball visibility but increases computational cost, which may limit real-time applicability on lower-resource systems. These limitations suggest potential directions for future work, including multi-frame ball reasoning, temporal smoothing, or specialized ball-focused detection modules.</w:t>
       </w:r>
       <w:r>
         <w:t xml:space="preserve"> </w:t>
       </w:r>
       <w:r>
-        <w:t>Recall measured how many real objects were successfully detected (i.e., low false negatives).</w:t>
+        <w:t xml:space="preserve">The </w:t>
+      </w:r>
+      <w:r>
+        <w:t>result</w:t>
+      </w:r>
+      <w:r>
+        <w:t xml:space="preserve"> of this work demonstrate</w:t>
+      </w:r>
+      <w:r>
+        <w:t>s</w:t>
+      </w:r>
+      <w:r>
+        <w:t xml:space="preserve"> the proposed detection and tracking pipeline performs reliably</w:t>
+      </w:r>
+      <w:r>
+        <w:t>; however,</w:t>
+      </w:r>
+      <w:r>
+        <w:t xml:space="preserve"> limitations </w:t>
+      </w:r>
+      <w:r>
+        <w:t>hinder</w:t>
+      </w:r>
+      <w:r>
+        <w:t xml:space="preserve"> its broader </w:t>
+      </w:r>
+      <w:r>
+        <w:lastRenderedPageBreak/>
+        <w:t>applicability. In</w:t>
+      </w:r>
+      <w:r>
+        <w:t xml:space="preserve"> turn this can suggest directions for future work. </w:t>
+      </w:r>
+      <w:r>
+        <w:t>E</w:t>
+      </w:r>
+      <w:r>
+        <w:t xml:space="preserve">xamples of </w:t>
+      </w:r>
+      <w:r>
+        <w:t>limitations</w:t>
+      </w:r>
+      <w:r>
+        <w:t xml:space="preserve"> and potentially the focus of future work include long term trackin</w:t>
+      </w:r>
+      <w:r>
+        <w:t>g, diverse camera angles, and team classification</w:t>
+      </w:r>
+      <w:r>
+        <w:t xml:space="preserve">. </w:t>
+      </w:r>
+    </w:p>
+    <w:p>
+      <w:proofErr w:type="spellStart"/>
+      <w:r>
+        <w:t>ByteTrack</w:t>
+      </w:r>
+      <w:proofErr w:type="spellEnd"/>
+      <w:r>
+        <w:t xml:space="preserve"> was used to</w:t>
+      </w:r>
+      <w:r>
+        <w:t xml:space="preserve"> assign unique IDs to each </w:t>
+      </w:r>
+      <w:r>
+        <w:t>player,</w:t>
+      </w:r>
+      <w:r>
+        <w:t xml:space="preserve"> but</w:t>
+      </w:r>
+      <w:r>
+        <w:t xml:space="preserve"> these </w:t>
+      </w:r>
+      <w:r>
+        <w:t>IDs</w:t>
+      </w:r>
+      <w:r>
+        <w:t xml:space="preserve"> are randomly generated and do not correspond to jersey numbers</w:t>
+      </w:r>
+      <w:r>
+        <w:t xml:space="preserve">. </w:t>
+      </w:r>
+      <w:r>
+        <w:t>Also,</w:t>
+      </w:r>
+      <w:r>
+        <w:t xml:space="preserve"> they tend to be assigned a new ID when they exit and re-enter the frame.</w:t>
+      </w:r>
+      <w:r>
+        <w:t xml:space="preserve"> This presents a challenge for applications requiring persistent player-level statistics, such as monitoring individual performance.</w:t>
+      </w:r>
+      <w:r>
+        <w:t xml:space="preserve"> Ensuring players maintain consistent identities would move the system closer to real-world usability. Techniques such as appearance-based re-identification networks, sequence modeling, or temporal feature aggregation could be leveraged in future studies.</w:t>
+      </w:r>
+    </w:p>
+    <w:p>
+      <w:r>
+        <w:t xml:space="preserve">Due to </w:t>
+      </w:r>
+      <w:r>
+        <w:t xml:space="preserve">the model </w:t>
+      </w:r>
+      <w:r>
+        <w:t>being</w:t>
+      </w:r>
+      <w:r>
+        <w:t xml:space="preserve"> trained </w:t>
+      </w:r>
+      <w:r>
+        <w:t>soley</w:t>
+      </w:r>
+      <w:r>
+        <w:t xml:space="preserve"> on broadcast-style footage, it generalizes poorly to alternative camera angles such as elevated tactical views, handheld sideline recordings, or drone perspectives. This angle sensitivity reflects both </w:t>
+      </w:r>
+      <w:r>
+        <w:t>the</w:t>
+      </w:r>
+      <w:r>
+        <w:t xml:space="preserve"> limitations </w:t>
+      </w:r>
+      <w:r>
+        <w:t xml:space="preserve">of the dataset </w:t>
+      </w:r>
+      <w:r>
+        <w:t>and the difficulty of training models to handle diverse geometric distortions in sports footage.</w:t>
+      </w:r>
+      <w:r>
+        <w:t xml:space="preserve"> Expanding the training dataset to include footage captured from various angles would significantly improve model robustness and reduce its dependence on broadcast views.</w:t>
+      </w:r>
+    </w:p>
+    <w:p>
+      <w:r>
+        <w:t xml:space="preserve">Team classification </w:t>
+      </w:r>
+      <w:r>
+        <w:t>i</w:t>
+      </w:r>
+      <w:r>
+        <w:t xml:space="preserve">s another limitation of the proposed pipeline. While CLIP-based appearance embeddings enabled unsupervised team clustering, performance degraded under challenging lighting conditions. </w:t>
+      </w:r>
+      <w:proofErr w:type="gramStart"/>
+      <w:r>
+        <w:t>In particular, players</w:t>
+      </w:r>
+      <w:proofErr w:type="gramEnd"/>
+      <w:r>
+        <w:t xml:space="preserve"> in direct sunlight were occasionally misclassified as members of the opposing team, especially when one team wore darker kits. In addition, team assignments were computed on a per-frame basis without temporal anchoring, allowing cluster identities to flip across frames. As a result, entire teams could be inconsistently labeled over time despite visually coherent player appearances. Future work could address this limitation by incorporating temporal constraints or sequence-level clustering to enforce consistent team identities across frames.</w:t>
+      </w:r>
+    </w:p>
+    <w:p>
+      <w:pPr>
+        <w:pStyle w:val="Heading1"/>
+      </w:pPr>
+      <w:r>
+        <w:t>Conclusion</w:t>
+      </w:r>
+    </w:p>
+    <w:p>
+      <w:r>
+        <w:t xml:space="preserve">This paper set out to address the core problem of </w:t>
+      </w:r>
+      <w:r>
+        <w:t>detecting and tracking objects in soccer footage</w:t>
+      </w:r>
+      <w:r>
+        <w:t xml:space="preserve"> using only a single broadcast camera. To accomplish this, a modern Y</w:t>
+      </w:r>
+      <w:r>
+        <w:t>OLOv8s</w:t>
+      </w:r>
+      <w:r>
+        <w:t xml:space="preserve"> object detection model</w:t>
+      </w:r>
+      <w:r>
+        <w:t xml:space="preserve"> was employed</w:t>
       </w:r>
       <w:r>
         <w:t xml:space="preserve"> </w:t>
       </w:r>
       <w:r>
-        <w:t>mAP50 evaluated accuracy at an Intersection over Union (</w:t>
-      </w:r>
-      <w:proofErr w:type="spellStart"/>
-      <w:r>
-        <w:t>IoU</w:t>
-      </w:r>
-      <w:proofErr w:type="spellEnd"/>
-      <w:r>
-        <w:t>) threshold of 0.5. This is the primary detection score and is widely used for comparing models.</w:t>
-      </w:r>
-      <w:r>
-        <w:t xml:space="preserve"> </w:t>
-      </w:r>
-      <w:r>
-        <w:t xml:space="preserve">mAP50–95 calculated mean Average Precision across </w:t>
-      </w:r>
-      <w:proofErr w:type="spellStart"/>
-      <w:r>
-        <w:t>IoU</w:t>
-      </w:r>
-      <w:proofErr w:type="spellEnd"/>
-      <w:r>
-        <w:t xml:space="preserve"> thresholds from 0.5 to 0.95 in steps of 0.05, providing a more thorough understanding of detection quality at varying levels of strictness.</w:t>
-      </w:r>
-      <w:r>
-        <w:t xml:space="preserve"> </w:t>
-      </w:r>
-      <w:r>
-        <w:t>These metrics collectively allowed for a detailed view of model performance across all object classes.</w:t>
-      </w:r>
-    </w:p>
-    <w:p>
-      <w:pPr>
-        <w:pStyle w:val="Subtitle"/>
-      </w:pPr>
-      <w:r>
-        <w:t>Original Contributions</w:t>
-      </w:r>
-    </w:p>
-    <w:p>
-      <w:r>
-        <w:t xml:space="preserve">A key original contribution of this work is the class-specific performance reporting. To the best of my knowledge, prior studies in soccer-focused computer vision do not break down detection metrics by class. This study evaluates class-level performance for players, referees, goalkeepers, and the ball, providing more fine-grained insights into model behavior. Additionally, integrating YOLOv8 with a pitch </w:t>
-      </w:r>
-      <w:proofErr w:type="spellStart"/>
-      <w:r>
-        <w:t>keypoint</w:t>
-      </w:r>
-      <w:proofErr w:type="spellEnd"/>
-      <w:r>
-        <w:t xml:space="preserve"> detector represents a modern, up-to-date methodological contribution to soccer analytics research.</w:t>
-      </w:r>
-    </w:p>
-    <w:p>
-      <w:pPr>
-        <w:pStyle w:val="Heading1"/>
-      </w:pPr>
-      <w:r>
-        <w:t>Results</w:t>
-      </w:r>
-    </w:p>
-    <w:p>
-      <w:r>
-        <w:t xml:space="preserve">To evaluate the performance of the proposed detection and tracking pipeline, I report four standard object-detection metrics: Precision, Recall, mAP50, and mAP50–95. These metrics are widely used in computer vision because they assess different and complementary aspects of model performance. Precision measures the proportion of correct detections and indicates how well the model avoids false positives, which is particularly relevant in scenarios where objects such as cleats or heads may resemble the ball. Recall evaluates how many real objects were successfully detected, reflecting the model’s ability to avoid missed detections. The mAP50 metric, computed at an </w:t>
-      </w:r>
-      <w:proofErr w:type="spellStart"/>
-      <w:r>
-        <w:t>IoU</w:t>
-      </w:r>
-      <w:proofErr w:type="spellEnd"/>
-      <w:r>
-        <w:t xml:space="preserve"> threshold of 0.5, provides a general measure of detection accuracy and is the </w:t>
-      </w:r>
-      <w:proofErr w:type="gramStart"/>
-      <w:r>
-        <w:t>most commonly reported</w:t>
-      </w:r>
-      <w:proofErr w:type="gramEnd"/>
-      <w:r>
-        <w:t xml:space="preserve"> score for YOLO-style detectors. Finally, mAP50–95 averages </w:t>
-      </w:r>
-      <w:proofErr w:type="spellStart"/>
-      <w:r>
-        <w:t>mAP</w:t>
-      </w:r>
-      <w:proofErr w:type="spellEnd"/>
-      <w:r>
-        <w:t xml:space="preserve"> across stricter </w:t>
-      </w:r>
-      <w:proofErr w:type="spellStart"/>
-      <w:r>
-        <w:t>IoU</w:t>
-      </w:r>
-      <w:proofErr w:type="spellEnd"/>
-      <w:r>
-        <w:t xml:space="preserve"> thresholds (0.5 to 0.95), offering a more rigorous evaluation of precise localization. Together, these metrics give a comprehensive understanding of detector reliability and bounding-box quality.</w:t>
-      </w:r>
-    </w:p>
-    <w:p>
-      <w:r>
-        <w:t xml:space="preserve">Quantitatively, the model demonstrates strong performance across most classes. For all objects combined, the model achieves a precision of 0.884, recall of 0.828, mAP50 of 0.871, and mAP50–95 of 0.583 across 1,174 total instances. Player detection is particularly </w:t>
-      </w:r>
-      <w:r>
+        <w:t>to</w:t>
+      </w:r>
+      <w:r>
+        <w:t xml:space="preserve"> identify and localiz</w:t>
+      </w:r>
+      <w:r>
+        <w:t>e</w:t>
+      </w:r>
+      <w:r>
+        <w:t xml:space="preserve"> individuals on the field.</w:t>
+      </w:r>
+    </w:p>
+    <w:p>
+      <w:r>
+        <w:rPr>
+          <w:kern w:val="0"/>
+          <w14:ligatures w14:val="none"/>
+        </w:rPr>
+        <w:t xml:space="preserve">The results showed that artificial intelligence can </w:t>
+      </w:r>
+      <w:r>
+        <w:rPr>
+          <w:kern w:val="0"/>
+          <w14:ligatures w14:val="none"/>
+        </w:rPr>
+        <w:t xml:space="preserve">reliably </w:t>
+      </w:r>
+      <w:r>
+        <w:rPr>
+          <w:kern w:val="0"/>
+          <w14:ligatures w14:val="none"/>
+        </w:rPr>
+        <w:t>detect and track players, referees,</w:t>
+      </w:r>
+      <w:r>
+        <w:rPr>
+          <w:kern w:val="0"/>
+          <w14:ligatures w14:val="none"/>
+        </w:rPr>
+        <w:t xml:space="preserve"> and</w:t>
+      </w:r>
+      <w:r>
+        <w:rPr>
+          <w:kern w:val="0"/>
+          <w14:ligatures w14:val="none"/>
+        </w:rPr>
+        <w:t xml:space="preserve"> goalkeepers</w:t>
+      </w:r>
+      <w:r>
+        <w:rPr>
+          <w:kern w:val="0"/>
+          <w14:ligatures w14:val="none"/>
+        </w:rPr>
+        <w:t>, but the model struggles to track the ball. Overall, this study</w:t>
+      </w:r>
+      <w:r>
+        <w:rPr>
+          <w:kern w:val="0"/>
+          <w14:ligatures w14:val="none"/>
+        </w:rPr>
+        <w:t xml:space="preserve"> confirm</w:t>
+      </w:r>
+      <w:r>
+        <w:rPr>
+          <w:kern w:val="0"/>
+          <w14:ligatures w14:val="none"/>
+        </w:rPr>
+        <w:t>s</w:t>
+      </w:r>
+      <w:r>
+        <w:rPr>
+          <w:kern w:val="0"/>
+          <w14:ligatures w14:val="none"/>
+        </w:rPr>
+        <w:t xml:space="preserve"> that single-camera systems are a viable pathway to affordable, scalable soccer analytics. Nonetheless, the work provides strong evidence that AI-based pipelines can </w:t>
+      </w:r>
+      <w:r>
+        <w:rPr>
+          <w:kern w:val="0"/>
+          <w14:ligatures w14:val="none"/>
+        </w:rPr>
         <w:lastRenderedPageBreak/>
-        <w:t>strong, with precision and recall near perfect (0.957 and 0.978, respectively) and an mAP50 of 0.993. Goalkeepers and referees also exhibit reliable detection, each with mAP50 values above 0.93. In contrast, ball detection is significantly more challenging. Although precision remains high at 0.914, recall drops to 0.511 and mAP50 to 0.616, indicating that while the model is usually correct when it identifies the ball, it frequently fails to detect it under difficult conditions. The large gap between player-related metrics and ball-related metrics reflects fundamental differences in object size, visibility, and occlusion patterns.</w:t>
-      </w:r>
-    </w:p>
-    <w:p>
-      <w:r>
-        <w:t xml:space="preserve">Direct comparison to prior work is limited by the lack of standardized public benchmarks that include the same set of soccer-specific classes. However, relative to performance reported in similar sports-analytics studies using YOLO-based architectures, my model performs competitively for players, referees, and goalkeepers, often matching or exceeding baseline </w:t>
-      </w:r>
-      <w:proofErr w:type="spellStart"/>
-      <w:r>
-        <w:t>mAP</w:t>
-      </w:r>
-      <w:proofErr w:type="spellEnd"/>
-      <w:r>
-        <w:t xml:space="preserve"> values. The primary area where performance lags—ball detection—is also well documented in existing literature, where the ball’s small size, motion blur, and frequent occlusion consistently degrade detector performance. Thus, the observed results align with known challenges in sports-tracking research.</w:t>
-      </w:r>
-    </w:p>
-    <w:p>
-      <w:r>
-        <w:t xml:space="preserve">Qualitatively, detection and tracking visualizations support the numerical findings. In frames with clear visibility, the model consistently identifies all players, assigns stable tracking IDs via </w:t>
-      </w:r>
-      <w:proofErr w:type="spellStart"/>
-      <w:r>
-        <w:t>ByteTrack</w:t>
-      </w:r>
-      <w:proofErr w:type="spellEnd"/>
-      <w:r>
-        <w:t xml:space="preserve">, and correctly clusters players into their respective teams using UMAP embeddings and </w:t>
-      </w:r>
-      <w:proofErr w:type="spellStart"/>
-      <w:r>
-        <w:t>KMeans</w:t>
-      </w:r>
-      <w:proofErr w:type="spellEnd"/>
-      <w:r>
-        <w:t xml:space="preserve"> clustering. Success cases show robust tracking even during player movement, crowding, or partial overlaps. Failure cases predominantly involve the ball: instances where the ball is fully or partially hidden behind players, blurred during rapid movement, or similar in appearance to cleats or light-colored head regions often lead to missed detections or occasional false positives. These visual analyses reinforce the statistical observation that player detection is highly reliable, while ball detection is the primary source of error.</w:t>
-      </w:r>
-    </w:p>
-    <w:p>
-      <w:r>
-        <w:t>Several trends emerge from the results. The model generalizes well to broadcast-style footage, maintaining strong detection accuracy across varying camera angles, lighting conditions, and field layouts. The very high performance on players, referees, and goalkeepers suggests that the YOLOv8s architecture captures the relevant spatial features effectively, even at the smaller model size. However, performance on the ball demonstrates the limitations of standard 2D detection methods when applied to extremely small or occluded objects. The discrepancy between high precision and low recall for the ball indicates that the model understands the ball’s characteristics but often lacks sufficient visual evidence to confidently detect it. These trends highlight both the strengths and challenges inherent in broadcast soccer analysis.</w:t>
-      </w:r>
-    </w:p>
-    <w:p>
-      <w:r>
-        <w:lastRenderedPageBreak/>
-        <w:t>Despite the overall strong performance, the results reveal several limitations. The most significant is the difficulty of accurately detecting the ball, particularly in crowded scenes or when the camera angle obscures the object. False positives sometimes occur when cleats or bald heads resemble the ball, and false negatives arise when the ball is occluded by players’ bodies. Additionally, the reliance on higher-resolution inputs (1280×1280) improves ball visibility but increases computational cost, which may limit real-time applicability on lower-resource systems. These limitations suggest potential directions for future work, including multi-frame ball reasoning, temporal smoothing, or specialized ball-focused detection modules.</w:t>
-      </w:r>
-    </w:p>
-    <w:p>
-      <w:pPr>
-        <w:pStyle w:val="Heading1"/>
-      </w:pPr>
-      <w:r>
-        <w:t>Discussion</w:t>
-      </w:r>
-    </w:p>
-    <w:p>
-      <w:r>
-        <w:t xml:space="preserve">The results of this work demonstrate that the proposed detection and tracking pipeline performs reliably in identifying players, referees, and goalkeepers, but several limitations remain that constrain its broader applicability. First, although </w:t>
-      </w:r>
-      <w:proofErr w:type="spellStart"/>
-      <w:r>
-        <w:t>ByteTrack</w:t>
-      </w:r>
-      <w:proofErr w:type="spellEnd"/>
-      <w:r>
-        <w:t xml:space="preserve"> assigns unique IDs to each player, these identifiers are randomly generated and do not correspond to jersey numbers or stable player identities across long sequences. When a player exits the frame and later re-enters, the model assigns a new ID, which interrupts continuous identity tracking. This presents a challenge for applications requiring persistent player-level statistics, such as monitoring individual performance, physical metrics, or tactical behavior. Additionally, because the model was trained primarily on broadcast-style footage, it generalizes poorly to alternative camera angles such as elevated tactical views, handheld sideline recordings, or drone perspectives. This angle sensitivity reflects both dataset limitations and the difficulty of training models to handle diverse geometric distortions in sports footage.</w:t>
-      </w:r>
-    </w:p>
-    <w:p>
-      <w:r>
-        <w:t>These limitations suggest several directions for future work. The ability to extract accurate coordinate data from video is foundational for building fully automated analytical systems in soccer. With high-quality positional data, researchers can derive event data, compute advanced team-level metrics, and generate player-specific statistics—capabilities traditionally reserved for professional clubs with expensive multi-camera setups. Expanding the training dataset to include footage captured from various angles would significantly improve model robustness and reduce its dependence on broadcast views. Furthermore, solving the player re-identification problem—ensuring that players maintain consistent identities even after leaving and re-entering the frame—would move the system closer to real-world usability. Techniques such as appearance-based re-identification networks, sequence modeling, or temporal feature aggregation could support this improvement.</w:t>
-      </w:r>
-    </w:p>
-    <w:p>
-      <w:r>
-        <w:lastRenderedPageBreak/>
-        <w:t>Interpreting these results in the context of the original problem, the findings indicate that AI-based systems can reliably detect and track soccer players from standard broadcast video. This is a critical first step toward automating the extraction of meaningful analytics from matches. Unlike professional teams, which typically rely on 8–12 synchronized cameras to reconstruct player coordinates and events, this pipeline operates effectively using only a single camera. This represents a major advantage for colleges, academies, and amateur clubs that lack the budget or infrastructure for advanced tracking systems. By demonstrating that high-quality detections can be achieved with minimal hardware, this work lowers the barrier to entry for data-driven performance analysis and provides a foundation for more accessible, scalable soccer analytics tools.</w:t>
-      </w:r>
-    </w:p>
-    <w:p>
-      <w:pPr>
-        <w:pStyle w:val="Heading1"/>
-      </w:pPr>
-      <w:r>
-        <w:t>Conclusion</w:t>
-      </w:r>
-    </w:p>
-    <w:p>
-      <w:r>
-        <w:t xml:space="preserve">This paper set out to address the core problem of extracting reliable coordinate data from raw match footage using only a single broadcast camera. Achieving this goal required developing a pipeline capable of detecting and tracking players, referees, goalkeepers, and the ball directly from video frames. To accomplish this, I employed a modern You Only Look Once (YOLO)–based object detection model combined with a tracking algorithm and a pitch </w:t>
-      </w:r>
-      <w:proofErr w:type="spellStart"/>
-      <w:r>
-        <w:t>keypoint</w:t>
-      </w:r>
-      <w:proofErr w:type="spellEnd"/>
-      <w:r>
-        <w:t xml:space="preserve"> detector, forming a complete system for identifying and localizing key individuals on the field.</w:t>
-      </w:r>
-    </w:p>
-    <w:p>
-      <w:r>
-        <w:t>The results demonstrate that artificial intelligence can reliably detect and track players, referees, and goalkeepers in broadcast footage, confirming that single-camera systems are a viable pathway toward affordable, scalable soccer analytics. The primary limitation lies in ball detection: because the ball is small, fast-moving, and frequently occluded, the model struggles to track it consistently. Nonetheless, the work provides strong evidence that AI-based pipelines can extract meaningful positional information from match footage without the costly multi-camera setups used in professional clubs.</w:t>
-      </w:r>
-    </w:p>
-    <w:p>
-      <w:r>
-        <w:t>These findings are significant for both the sports analytics research community and practical applications in soccer. For professional clubs, this work helps validate the role of computer vision in enabling automated, data-driven analysis. For colleges, academies, and amateur teams—organizations that lack access to advanced tracking technologies—this approach offers a realistic and accessible path to integrating AI into scouting and performance evaluation. By lowering the resource barriers to data collection, this work expands the potential user base for analytical tools and supports more equitable access to modern recruitment methods.</w:t>
-      </w:r>
-    </w:p>
-    <w:p>
-      <w:r>
-        <w:lastRenderedPageBreak/>
-        <w:t>The main insight gained from this study is that reliable player detection and tracking can be achieved using current state-of-the-art models and a single camera, showing that the foundational components of an automated analytical pipeline are achievable with modest hardware. However, important limitations remain. The model was trained primarily on broadcast footage, which restricts its generalizability to other camera angles or lower-quality recordings. Future work should include diversifying the training data, improving ball detection, and developing more robust re-identification methods to maintain consistent player identities across longer sequences.</w:t>
-      </w:r>
-    </w:p>
-    <w:p>
-      <w:r>
-        <w:t>In closing, this paper demonstrates that AI-driven soccer analytics are both feasible and increasingly accessible. By combining modern computer vision techniques with practical, real-world footage, this work contributes to the growing body of research at the intersection of sports and artificial intelligence and moves the field toward scalable, automated, and widely usable performance analysis tools.</w:t>
+        <w:t>extract meaningful positional information from match footage without the costly multi-camera setups used by professional clubs.</w:t>
+      </w:r>
+    </w:p>
+    <w:p>
+      <w:r>
+        <w:t xml:space="preserve">These findings are significant for both the sports analytics research community and practical applications in soccer. For professional clubs, this work helps validate the role of computer vision in enabling automated, data-driven analysis. For colleges, academies, and amateur teams—organizations that lack access to advanced tracking technologies—this approach offers a </w:t>
+      </w:r>
+      <w:r>
+        <w:t>practical</w:t>
+      </w:r>
+      <w:r>
+        <w:t>,</w:t>
+      </w:r>
+      <w:r>
+        <w:t xml:space="preserve"> accessible path to integrating AI into scouting and performance evaluation. By lowering barriers to data collection, this work expands the potential user base for analytical tools and supports more equitable access to modern recruitment methods.</w:t>
+      </w:r>
+      <w:r>
+        <w:t xml:space="preserve"> Moreover, these findings </w:t>
+      </w:r>
+      <w:r>
+        <w:t>establish</w:t>
+      </w:r>
+      <w:r>
+        <w:t xml:space="preserve"> a class-level empirical baseline for applying novel algorithms as artificial intelligence continues to </w:t>
+      </w:r>
+      <w:r>
+        <w:t>advance</w:t>
+      </w:r>
+      <w:r>
+        <w:t>.</w:t>
       </w:r>
     </w:p>
     <w:p/>
@@ -874,314 +1939,207 @@
         <w:ind w:left="1008" w:hanging="1008"/>
       </w:pPr>
       <w:r>
-        <w:t xml:space="preserve">P. S. S. </w:t>
+        <w:t xml:space="preserve">Cioppa, A., et al. </w:t>
       </w:r>
       <w:proofErr w:type="spellStart"/>
       <w:r>
+        <w:t>SoccerNet</w:t>
+      </w:r>
+      <w:proofErr w:type="spellEnd"/>
+      <w:r>
+        <w:t>: A Scalable Dataset for Action Spotting in Soccer Videos. Proceedings of the IEEE/CVF Conference on Computer Vision and Pattern Recognition (CVPR) Workshops.</w:t>
+      </w:r>
+    </w:p>
+    <w:p>
+      <w:pPr>
+        <w:ind w:left="1008" w:hanging="1008"/>
+      </w:pPr>
+      <w:r>
+        <w:t xml:space="preserve">Jocher, G., et al. </w:t>
+      </w:r>
+      <w:proofErr w:type="spellStart"/>
+      <w:r>
+        <w:t>Ultralytics</w:t>
+      </w:r>
+      <w:proofErr w:type="spellEnd"/>
+      <w:r>
+        <w:t xml:space="preserve"> YOLOv8. </w:t>
+      </w:r>
+      <w:proofErr w:type="spellStart"/>
+      <w:r>
+        <w:t>Ultralytics</w:t>
+      </w:r>
+      <w:proofErr w:type="spellEnd"/>
+      <w:r>
+        <w:t xml:space="preserve"> technical report, </w:t>
+      </w:r>
+      <w:proofErr w:type="spellStart"/>
+      <w:r>
+        <w:t>arXiv</w:t>
+      </w:r>
+      <w:proofErr w:type="spellEnd"/>
+      <w:r>
+        <w:t>.</w:t>
+      </w:r>
+    </w:p>
+    <w:p>
+      <w:pPr>
+        <w:ind w:left="1008" w:hanging="1008"/>
+      </w:pPr>
+      <w:r>
+        <w:t>Kershaw, T. “The Secretive Analytics Company Helping Clubs Unearth the Next Moisés Caicedo.” The Times, 2025. Available at: https://www.thetimes.com/sport/football/article/jamestown-analytics-data-football-moises-caicedo-gxztr67hk (accessed December 8, 2025).</w:t>
+      </w:r>
+    </w:p>
+    <w:p>
+      <w:pPr>
+        <w:ind w:left="1008" w:hanging="1008"/>
+      </w:pPr>
+      <w:r>
+        <w:t>Lu, W.-L., Ting, J.-A., Murphy, K. P., &amp; Little, J. J. Identifying Players in Broadcast Sports Videos Using Conditional Random Fields. Proceedings of the IEEE Conference on Computer Vision and Pattern Recognition (CVPR).</w:t>
+      </w:r>
+    </w:p>
+    <w:p>
+      <w:pPr>
+        <w:ind w:left="1008" w:hanging="1008"/>
+      </w:pPr>
+      <w:proofErr w:type="spellStart"/>
+      <w:r>
         <w:t>Markappa</w:t>
       </w:r>
       <w:proofErr w:type="spellEnd"/>
       <w:r>
-        <w:t xml:space="preserve">, C. O'Leary and C. Lynch, "A Review of YOLO Models for Soccer-Based Object Detection," 2024 Sixth International Conference on Intelligent Computing in Data Sciences (ICDS), Marrakech, Morocco, 2024, pp. 1-7, </w:t>
+        <w:t>, P. S. S., O’Leary, C., &amp; Lynch, C. “A Review of YOLO Models for Soccer-Based Object Detection.” Proceedings of the Sixth International Conference on Intelligent Computing in Data Sciences (ICDS), Marrakech, Morocco, 2024, pp. 1–7. doi:10.1109/ICDS62089.2024.10756443.</w:t>
+      </w:r>
+    </w:p>
+    <w:p>
+      <w:pPr>
+        <w:ind w:left="1008" w:hanging="1008"/>
+      </w:pPr>
+      <w:r>
+        <w:t xml:space="preserve">Redmon, J., </w:t>
       </w:r>
       <w:proofErr w:type="spellStart"/>
       <w:r>
-        <w:t>doi</w:t>
+        <w:t>Divvala</w:t>
       </w:r>
       <w:proofErr w:type="spellEnd"/>
       <w:r>
-        <w:t>: 10.1109/ICDS62089.2024.10756443. keywords: {</w:t>
+        <w:t xml:space="preserve">, S., </w:t>
       </w:r>
       <w:proofErr w:type="spellStart"/>
-      <w:proofErr w:type="gramStart"/>
-      <w:r>
-        <w:t>YOLO;Computer</w:t>
+      <w:r>
+        <w:t>Girshick</w:t>
       </w:r>
       <w:proofErr w:type="spellEnd"/>
-      <w:proofErr w:type="gramEnd"/>
-      <w:r>
-        <w:t xml:space="preserve"> </w:t>
-      </w:r>
+      <w:r>
+        <w:t>, R., &amp; Farhadi, A. You Only Look Once: Unified, Real-Time Object Detection. Proceedings of the IEEE Conference on Computer Vision and Pattern Recognition (CVPR).</w:t>
+      </w:r>
+    </w:p>
+    <w:p>
+      <w:pPr>
+        <w:ind w:left="1008" w:hanging="1008"/>
+      </w:pPr>
       <w:proofErr w:type="spellStart"/>
-      <w:proofErr w:type="gramStart"/>
-      <w:r>
-        <w:t>vision;Analytical</w:t>
+      <w:r>
+        <w:t>Roboflow</w:t>
       </w:r>
       <w:proofErr w:type="spellEnd"/>
-      <w:proofErr w:type="gramEnd"/>
-      <w:r>
-        <w:t xml:space="preserve"> </w:t>
+      <w:r>
+        <w:t xml:space="preserve">. Football Players Detection Dataset. </w:t>
       </w:r>
       <w:proofErr w:type="spellStart"/>
-      <w:proofErr w:type="gramStart"/>
-      <w:r>
-        <w:t>models;Reviews</w:t>
-      </w:r>
-      <w:proofErr w:type="gramEnd"/>
-      <w:r>
-        <w:t>;Computational</w:t>
+      <w:r>
+        <w:t>Roboflow</w:t>
       </w:r>
       <w:proofErr w:type="spellEnd"/>
       <w:r>
-        <w:t xml:space="preserve"> </w:t>
+        <w:t xml:space="preserve"> Universe, Aug. 2025. Available at: https://universe.roboflow.com/roboflow-jvuqo/football-players-detection-3zvbc (accessed December 8, 2025).</w:t>
+      </w:r>
+    </w:p>
+    <w:p>
+      <w:pPr>
+        <w:ind w:left="1008" w:hanging="1008"/>
+      </w:pPr>
+      <w:r>
+        <w:t>Swiss Ramble. “Brighton and Hove Albion Finances.” April 16, 2025. Available at: https://swissramble.substack.com/p/brighton-and-hove-albion-finances-50a.</w:t>
+      </w:r>
+    </w:p>
+    <w:p>
+      <w:pPr>
+        <w:ind w:left="1008" w:hanging="1008"/>
+      </w:pPr>
+      <w:r>
+        <w:t>Theiner, J., Gritz, W., Müller-</w:t>
       </w:r>
       <w:proofErr w:type="spellStart"/>
-      <w:proofErr w:type="gramStart"/>
-      <w:r>
-        <w:t>modeling;Data</w:t>
+      <w:r>
+        <w:t>Budack</w:t>
       </w:r>
       <w:proofErr w:type="spellEnd"/>
-      <w:proofErr w:type="gramEnd"/>
-      <w:r>
-        <w:t xml:space="preserve"> </w:t>
+      <w:r>
+        <w:t xml:space="preserve">, E., Rein, R., </w:t>
       </w:r>
       <w:proofErr w:type="spellStart"/>
-      <w:proofErr w:type="gramStart"/>
-      <w:r>
-        <w:t>visualization;Reproducibility</w:t>
+      <w:r>
+        <w:t>Memmert</w:t>
       </w:r>
       <w:proofErr w:type="spellEnd"/>
-      <w:proofErr w:type="gramEnd"/>
-      <w:r>
-        <w:t xml:space="preserve"> of </w:t>
+      <w:r>
+        <w:t xml:space="preserve">, D., &amp; </w:t>
       </w:r>
       <w:proofErr w:type="spellStart"/>
-      <w:proofErr w:type="gramStart"/>
-      <w:r>
-        <w:t>results;Libraries</w:t>
-      </w:r>
-      <w:proofErr w:type="gramEnd"/>
-      <w:r>
-        <w:t>;Research</w:t>
+      <w:r>
+        <w:t>Ewerth</w:t>
       </w:r>
       <w:proofErr w:type="spellEnd"/>
       <w:r>
-        <w:t xml:space="preserve"> and </w:t>
-      </w:r>
+        <w:t>, R. “Extraction of Positional Player Data from Broadcast Soccer Videos.” Proceedings of the IEEE/CVF Winter Conference on Applications of Computer Vision (WACV), 2022, pp. 1463–1473. doi:10.1109/WACV51458.2022.00153.</w:t>
+      </w:r>
+    </w:p>
+    <w:p>
+      <w:pPr>
+        <w:ind w:left="1008" w:hanging="1008"/>
+      </w:pPr>
+      <w:r>
+        <w:t>Thomas, K., et al. Player Tracking in Broadcast Sports Video. IEEE.</w:t>
+      </w:r>
+    </w:p>
+    <w:p>
+      <w:pPr>
+        <w:ind w:left="1008" w:hanging="1008"/>
+      </w:pPr>
       <w:proofErr w:type="spellStart"/>
-      <w:proofErr w:type="gramStart"/>
-      <w:r>
-        <w:t>development;Sports</w:t>
-      </w:r>
-      <w:proofErr w:type="gramEnd"/>
-      <w:r>
-        <w:t>;Machine</w:t>
+      <w:r>
+        <w:t>Transfermarkt</w:t>
       </w:r>
       <w:proofErr w:type="spellEnd"/>
       <w:r>
-        <w:t xml:space="preserve"> </w:t>
+        <w:t>. “Brighton &amp; Hove Albion — Club Profile.” Available at: https://www.transfermarkt.us/brighton-amp-hove-albion/startseite/verein/1237/saison_id/2022 (accessed December 8, 2025).</w:t>
+      </w:r>
+    </w:p>
+    <w:p>
+      <w:pPr>
+        <w:ind w:left="1008" w:hanging="1008"/>
+      </w:pPr>
+      <w:r>
+        <w:lastRenderedPageBreak/>
+        <w:t>Wojke, N., Bewley, A., &amp; Paulus, D. Simple Online and Realtime Tracking with a Deep Association Metric. Proceedings of the IEEE International Conference on Image Processing (ICIP).</w:t>
+      </w:r>
+    </w:p>
+    <w:p>
+      <w:pPr>
+        <w:ind w:left="1008" w:hanging="1008"/>
+      </w:pPr>
+      <w:r>
+        <w:t xml:space="preserve">Zhang, Y., et al. </w:t>
       </w:r>
       <w:proofErr w:type="spellStart"/>
-      <w:proofErr w:type="gramStart"/>
-      <w:r>
-        <w:t>Learning;Deep</w:t>
+      <w:r>
+        <w:t>ByteTrack</w:t>
       </w:r>
       <w:proofErr w:type="spellEnd"/>
-      <w:proofErr w:type="gramEnd"/>
-      <w:r>
-        <w:t xml:space="preserve"> </w:t>
-      </w:r>
-      <w:proofErr w:type="spellStart"/>
-      <w:proofErr w:type="gramStart"/>
-      <w:r>
-        <w:t>Learning;Computer</w:t>
-      </w:r>
-      <w:proofErr w:type="spellEnd"/>
-      <w:proofErr w:type="gramEnd"/>
-      <w:r>
-        <w:t xml:space="preserve"> Vision}</w:t>
-      </w:r>
-    </w:p>
-    <w:p>
-      <w:pPr>
-        <w:ind w:left="1008" w:hanging="1008"/>
-      </w:pPr>
-      <w:r>
-        <w:t>Swiss Ramble. “Brighton and Hove Albion Finances.” 16 Apr. 2025,</w:t>
-      </w:r>
-      <w:r>
-        <w:t xml:space="preserve"> </w:t>
-      </w:r>
-      <w:hyperlink r:id="rId5" w:history="1">
-        <w:r>
-          <w:t>https://swissramble.substack.com/p/brighton-and-hove-albion-finances-50a</w:t>
-        </w:r>
-      </w:hyperlink>
-      <w:r>
-        <w:t>.</w:t>
-      </w:r>
-    </w:p>
-    <w:p>
-      <w:pPr>
-        <w:ind w:left="1008" w:hanging="1008"/>
-      </w:pPr>
-      <w:r>
-        <w:t>Transfermarkt. “Brighton &amp; Hove Albion – Club Profile.”</w:t>
-      </w:r>
-      <w:r>
-        <w:t xml:space="preserve"> </w:t>
-      </w:r>
-      <w:hyperlink r:id="rId6" w:history="1">
-        <w:r>
-          <w:t>https://www.transfermarkt.us/brighton-amp-hove</w:t>
-        </w:r>
-        <w:r>
-          <w:t>-</w:t>
-        </w:r>
-        <w:r>
-          <w:t>albion/startseite/verein/1237/saison_id/2022</w:t>
-        </w:r>
-      </w:hyperlink>
-      <w:r>
-        <w:t>.</w:t>
-      </w:r>
-      <w:r>
-        <w:t xml:space="preserve"> </w:t>
-      </w:r>
-      <w:r>
-        <w:t>Accessed 8 Dec. 2025.</w:t>
-      </w:r>
-    </w:p>
-    <w:p>
-      <w:pPr>
-        <w:ind w:left="1008" w:hanging="1008"/>
-      </w:pPr>
-      <w:r>
-        <w:t>Kershaw, Tom. “The Secretive Analytics Company Helping Clubs Unearth Next Moisés Caicedo.” The Times,</w:t>
-      </w:r>
-      <w:r>
-        <w:t xml:space="preserve"> </w:t>
-      </w:r>
-      <w:r>
-        <w:t>2025, </w:t>
-      </w:r>
-      <w:hyperlink r:id="rId7" w:tgtFrame="_new" w:history="1">
-        <w:r>
-          <w:t>https://www.thetimes.com/sport/football/article/jamestown-analytics-data-football-moises-caicedo-gxztr67hk</w:t>
-        </w:r>
-      </w:hyperlink>
-      <w:r>
-        <w:t>. Accessed 8 Dec. 2025.</w:t>
-      </w:r>
-    </w:p>
-    <w:p>
-      <w:pPr>
-        <w:ind w:left="1008" w:hanging="1008"/>
-      </w:pPr>
-      <w:r>
-        <w:t>J. Theiner, W. Gritz, E. Müller-</w:t>
-      </w:r>
-      <w:proofErr w:type="spellStart"/>
-      <w:r>
-        <w:t>Budack</w:t>
-      </w:r>
-      <w:proofErr w:type="spellEnd"/>
-      <w:r>
-        <w:t xml:space="preserve">, R. Rein, D. </w:t>
-      </w:r>
-      <w:proofErr w:type="spellStart"/>
-      <w:r>
-        <w:t>Memmert</w:t>
-      </w:r>
-      <w:proofErr w:type="spellEnd"/>
-      <w:r>
-        <w:t xml:space="preserve"> and R. </w:t>
-      </w:r>
-      <w:proofErr w:type="spellStart"/>
-      <w:r>
-        <w:t>Ewerth</w:t>
-      </w:r>
-      <w:proofErr w:type="spellEnd"/>
-      <w:r>
-        <w:t xml:space="preserve">, "Extraction of Positional Player Data from Broadcast Soccer Videos," 2022 IEEE/CVF Winter Conference on Applications of Computer Vision (WACV), Waikoloa, HI, USA, 2022, pp. 1463-1473, </w:t>
-      </w:r>
-      <w:proofErr w:type="spellStart"/>
-      <w:r>
-        <w:t>doi</w:t>
-      </w:r>
-      <w:proofErr w:type="spellEnd"/>
-      <w:r>
-        <w:t>: 10.1109/WACV51458.2022.00153. keywords: {</w:t>
-      </w:r>
-      <w:proofErr w:type="spellStart"/>
-      <w:proofErr w:type="gramStart"/>
-      <w:r>
-        <w:t>Training;Measurement</w:t>
-      </w:r>
-      <w:proofErr w:type="gramEnd"/>
-      <w:r>
-        <w:t>;Computer</w:t>
-      </w:r>
-      <w:proofErr w:type="spellEnd"/>
-      <w:r>
-        <w:t xml:space="preserve"> </w:t>
-      </w:r>
-      <w:proofErr w:type="spellStart"/>
-      <w:proofErr w:type="gramStart"/>
-      <w:r>
-        <w:t>vision;Pipelines</w:t>
-      </w:r>
-      <w:proofErr w:type="gramEnd"/>
-      <w:r>
-        <w:t>;</w:t>
-      </w:r>
-      <w:proofErr w:type="gramStart"/>
-      <w:r>
-        <w:t>Estimation;Data</w:t>
-      </w:r>
-      <w:proofErr w:type="spellEnd"/>
-      <w:proofErr w:type="gramEnd"/>
-      <w:r>
-        <w:t xml:space="preserve"> </w:t>
-      </w:r>
-      <w:proofErr w:type="spellStart"/>
-      <w:proofErr w:type="gramStart"/>
-      <w:r>
-        <w:t>mining;Video</w:t>
-      </w:r>
-      <w:proofErr w:type="spellEnd"/>
-      <w:proofErr w:type="gramEnd"/>
-      <w:r>
-        <w:t xml:space="preserve"> </w:t>
-      </w:r>
-      <w:proofErr w:type="spellStart"/>
-      <w:proofErr w:type="gramStart"/>
-      <w:r>
-        <w:t>recording;Vision</w:t>
-      </w:r>
-      <w:proofErr w:type="spellEnd"/>
-      <w:proofErr w:type="gramEnd"/>
-      <w:r>
-        <w:t xml:space="preserve"> Systems and Applications}</w:t>
-      </w:r>
-    </w:p>
-    <w:p>
-      <w:pPr>
-        <w:ind w:left="1008" w:hanging="1008"/>
-      </w:pPr>
-      <w:proofErr w:type="spellStart"/>
-      <w:r>
-        <w:t>Roboflow</w:t>
-      </w:r>
-      <w:proofErr w:type="spellEnd"/>
-      <w:r>
-        <w:t>. *</w:t>
-      </w:r>
-      <w:proofErr w:type="gramStart"/>
-      <w:r>
-        <w:t>football</w:t>
-      </w:r>
-      <w:proofErr w:type="gramEnd"/>
-      <w:r>
-        <w:t xml:space="preserve">-players-detection Dataset*. </w:t>
-      </w:r>
-      <w:proofErr w:type="spellStart"/>
-      <w:r>
-        <w:t>Roboflow</w:t>
-      </w:r>
-      <w:proofErr w:type="spellEnd"/>
-      <w:r>
-        <w:t xml:space="preserve"> Universe, Aug. 2025, https://universe.roboflow.com/roboflow-jvuqo/football-players-detection-3zvbc. Accessed 8 Dec. 2025.</w:t>
+      <w:r>
+        <w:t>: Multi-Object Tracking by Associating Every Detection Box. Proceedings of the European Conference on Computer Vision (ECCV).</w:t>
       </w:r>
     </w:p>
     <w:sectPr>
@@ -1423,9 +2381,9 @@
     </w:lvl>
   </w:abstractNum>
   <w:abstractNum w:abstractNumId="2" w15:restartNumberingAfterBreak="0">
-    <w:nsid w:val="6E7D0E13"/>
+    <w:nsid w:val="5C7B2D76"/>
     <w:multiLevelType w:val="hybridMultilevel"/>
-    <w:tmpl w:val="27B46D9A"/>
+    <w:tmpl w:val="963AB248"/>
     <w:lvl w:ilvl="0" w:tplc="04090001">
       <w:start w:val="1"/>
       <w:numFmt w:val="bullet"/>
@@ -1447,7 +2405,7 @@
         <w:ind w:left="1440" w:hanging="360"/>
       </w:pPr>
       <w:rPr>
-        <w:rFonts w:ascii="Courier New" w:hAnsi="Courier New" w:hint="default"/>
+        <w:rFonts w:ascii="Courier New" w:hAnsi="Courier New" w:cs="Courier New" w:hint="default"/>
       </w:rPr>
     </w:lvl>
     <w:lvl w:ilvl="2" w:tplc="04090005" w:tentative="1">
@@ -1483,7 +2441,7 @@
         <w:ind w:left="3600" w:hanging="360"/>
       </w:pPr>
       <w:rPr>
-        <w:rFonts w:ascii="Courier New" w:hAnsi="Courier New" w:hint="default"/>
+        <w:rFonts w:ascii="Courier New" w:hAnsi="Courier New" w:cs="Courier New" w:hint="default"/>
       </w:rPr>
     </w:lvl>
     <w:lvl w:ilvl="5" w:tplc="04090005" w:tentative="1">
@@ -1519,6 +2477,119 @@
         <w:ind w:left="5760" w:hanging="360"/>
       </w:pPr>
       <w:rPr>
+        <w:rFonts w:ascii="Courier New" w:hAnsi="Courier New" w:cs="Courier New" w:hint="default"/>
+      </w:rPr>
+    </w:lvl>
+    <w:lvl w:ilvl="8" w:tplc="04090005" w:tentative="1">
+      <w:start w:val="1"/>
+      <w:numFmt w:val="bullet"/>
+      <w:lvlText w:val=""/>
+      <w:lvlJc w:val="left"/>
+      <w:pPr>
+        <w:ind w:left="6480" w:hanging="360"/>
+      </w:pPr>
+      <w:rPr>
+        <w:rFonts w:ascii="Wingdings" w:hAnsi="Wingdings" w:hint="default"/>
+      </w:rPr>
+    </w:lvl>
+  </w:abstractNum>
+  <w:abstractNum w:abstractNumId="3" w15:restartNumberingAfterBreak="0">
+    <w:nsid w:val="6E7D0E13"/>
+    <w:multiLevelType w:val="hybridMultilevel"/>
+    <w:tmpl w:val="27B46D9A"/>
+    <w:lvl w:ilvl="0" w:tplc="04090001">
+      <w:start w:val="1"/>
+      <w:numFmt w:val="bullet"/>
+      <w:lvlText w:val=""/>
+      <w:lvlJc w:val="left"/>
+      <w:pPr>
+        <w:ind w:left="720" w:hanging="360"/>
+      </w:pPr>
+      <w:rPr>
+        <w:rFonts w:ascii="Symbol" w:hAnsi="Symbol" w:hint="default"/>
+      </w:rPr>
+    </w:lvl>
+    <w:lvl w:ilvl="1" w:tplc="04090003" w:tentative="1">
+      <w:start w:val="1"/>
+      <w:numFmt w:val="bullet"/>
+      <w:lvlText w:val="o"/>
+      <w:lvlJc w:val="left"/>
+      <w:pPr>
+        <w:ind w:left="1440" w:hanging="360"/>
+      </w:pPr>
+      <w:rPr>
+        <w:rFonts w:ascii="Courier New" w:hAnsi="Courier New" w:hint="default"/>
+      </w:rPr>
+    </w:lvl>
+    <w:lvl w:ilvl="2" w:tplc="04090005" w:tentative="1">
+      <w:start w:val="1"/>
+      <w:numFmt w:val="bullet"/>
+      <w:lvlText w:val=""/>
+      <w:lvlJc w:val="left"/>
+      <w:pPr>
+        <w:ind w:left="2160" w:hanging="360"/>
+      </w:pPr>
+      <w:rPr>
+        <w:rFonts w:ascii="Wingdings" w:hAnsi="Wingdings" w:hint="default"/>
+      </w:rPr>
+    </w:lvl>
+    <w:lvl w:ilvl="3" w:tplc="04090001" w:tentative="1">
+      <w:start w:val="1"/>
+      <w:numFmt w:val="bullet"/>
+      <w:lvlText w:val=""/>
+      <w:lvlJc w:val="left"/>
+      <w:pPr>
+        <w:ind w:left="2880" w:hanging="360"/>
+      </w:pPr>
+      <w:rPr>
+        <w:rFonts w:ascii="Symbol" w:hAnsi="Symbol" w:hint="default"/>
+      </w:rPr>
+    </w:lvl>
+    <w:lvl w:ilvl="4" w:tplc="04090003" w:tentative="1">
+      <w:start w:val="1"/>
+      <w:numFmt w:val="bullet"/>
+      <w:lvlText w:val="o"/>
+      <w:lvlJc w:val="left"/>
+      <w:pPr>
+        <w:ind w:left="3600" w:hanging="360"/>
+      </w:pPr>
+      <w:rPr>
+        <w:rFonts w:ascii="Courier New" w:hAnsi="Courier New" w:hint="default"/>
+      </w:rPr>
+    </w:lvl>
+    <w:lvl w:ilvl="5" w:tplc="04090005" w:tentative="1">
+      <w:start w:val="1"/>
+      <w:numFmt w:val="bullet"/>
+      <w:lvlText w:val=""/>
+      <w:lvlJc w:val="left"/>
+      <w:pPr>
+        <w:ind w:left="4320" w:hanging="360"/>
+      </w:pPr>
+      <w:rPr>
+        <w:rFonts w:ascii="Wingdings" w:hAnsi="Wingdings" w:hint="default"/>
+      </w:rPr>
+    </w:lvl>
+    <w:lvl w:ilvl="6" w:tplc="04090001" w:tentative="1">
+      <w:start w:val="1"/>
+      <w:numFmt w:val="bullet"/>
+      <w:lvlText w:val=""/>
+      <w:lvlJc w:val="left"/>
+      <w:pPr>
+        <w:ind w:left="5040" w:hanging="360"/>
+      </w:pPr>
+      <w:rPr>
+        <w:rFonts w:ascii="Symbol" w:hAnsi="Symbol" w:hint="default"/>
+      </w:rPr>
+    </w:lvl>
+    <w:lvl w:ilvl="7" w:tplc="04090003" w:tentative="1">
+      <w:start w:val="1"/>
+      <w:numFmt w:val="bullet"/>
+      <w:lvlText w:val="o"/>
+      <w:lvlJc w:val="left"/>
+      <w:pPr>
+        <w:ind w:left="5760" w:hanging="360"/>
+      </w:pPr>
+      <w:rPr>
         <w:rFonts w:ascii="Courier New" w:hAnsi="Courier New" w:hint="default"/>
       </w:rPr>
     </w:lvl>
@@ -1539,10 +2610,13 @@
     <w:abstractNumId w:val="0"/>
   </w:num>
   <w:num w:numId="2" w16cid:durableId="1027682229">
-    <w:abstractNumId w:val="2"/>
+    <w:abstractNumId w:val="3"/>
   </w:num>
   <w:num w:numId="3" w16cid:durableId="425426857">
     <w:abstractNumId w:val="1"/>
+  </w:num>
+  <w:num w:numId="4" w16cid:durableId="1681421388">
+    <w:abstractNumId w:val="2"/>
   </w:num>
 </w:numbering>
 </file>
@@ -2148,6 +3222,7 @@
   <w:style w:type="character" w:default="1" w:styleId="DefaultParagraphFont">
     <w:name w:val="Default Paragraph Font"/>
     <w:uiPriority w:val="1"/>
+    <w:semiHidden/>
     <w:unhideWhenUsed/>
   </w:style>
   <w:style w:type="table" w:default="1" w:styleId="TableNormal">
@@ -2497,6 +3572,112 @@
       <w:i/>
       <w:iCs/>
     </w:rPr>
+  </w:style>
+  <w:style w:type="paragraph" w:styleId="Revision">
+    <w:name w:val="Revision"/>
+    <w:hidden/>
+    <w:uiPriority w:val="99"/>
+    <w:semiHidden/>
+    <w:rsid w:val="00F940F3"/>
+    <w:pPr>
+      <w:spacing w:after="0" w:line="240" w:lineRule="auto"/>
+    </w:pPr>
+  </w:style>
+  <w:style w:type="character" w:styleId="CommentReference">
+    <w:name w:val="annotation reference"/>
+    <w:basedOn w:val="DefaultParagraphFont"/>
+    <w:uiPriority w:val="99"/>
+    <w:semiHidden/>
+    <w:unhideWhenUsed/>
+    <w:rsid w:val="00F940F3"/>
+    <w:rPr>
+      <w:sz w:val="16"/>
+      <w:szCs w:val="16"/>
+    </w:rPr>
+  </w:style>
+  <w:style w:type="paragraph" w:styleId="CommentText">
+    <w:name w:val="annotation text"/>
+    <w:basedOn w:val="Normal"/>
+    <w:link w:val="CommentTextChar"/>
+    <w:uiPriority w:val="99"/>
+    <w:semiHidden/>
+    <w:unhideWhenUsed/>
+    <w:rsid w:val="00F940F3"/>
+    <w:pPr>
+      <w:spacing w:line="240" w:lineRule="auto"/>
+    </w:pPr>
+    <w:rPr>
+      <w:sz w:val="20"/>
+      <w:szCs w:val="20"/>
+    </w:rPr>
+  </w:style>
+  <w:style w:type="character" w:customStyle="1" w:styleId="CommentTextChar">
+    <w:name w:val="Comment Text Char"/>
+    <w:basedOn w:val="DefaultParagraphFont"/>
+    <w:link w:val="CommentText"/>
+    <w:uiPriority w:val="99"/>
+    <w:semiHidden/>
+    <w:rsid w:val="00F940F3"/>
+    <w:rPr>
+      <w:sz w:val="20"/>
+      <w:szCs w:val="20"/>
+    </w:rPr>
+  </w:style>
+  <w:style w:type="paragraph" w:styleId="CommentSubject">
+    <w:name w:val="annotation subject"/>
+    <w:basedOn w:val="CommentText"/>
+    <w:next w:val="CommentText"/>
+    <w:link w:val="CommentSubjectChar"/>
+    <w:uiPriority w:val="99"/>
+    <w:semiHidden/>
+    <w:unhideWhenUsed/>
+    <w:rsid w:val="00F940F3"/>
+    <w:rPr>
+      <w:b/>
+      <w:bCs/>
+    </w:rPr>
+  </w:style>
+  <w:style w:type="character" w:customStyle="1" w:styleId="CommentSubjectChar">
+    <w:name w:val="Comment Subject Char"/>
+    <w:basedOn w:val="CommentTextChar"/>
+    <w:link w:val="CommentSubject"/>
+    <w:uiPriority w:val="99"/>
+    <w:semiHidden/>
+    <w:rsid w:val="00F940F3"/>
+    <w:rPr>
+      <w:b/>
+      <w:bCs/>
+      <w:sz w:val="20"/>
+      <w:szCs w:val="20"/>
+    </w:rPr>
+  </w:style>
+  <w:style w:type="table" w:styleId="TableGrid">
+    <w:name w:val="Table Grid"/>
+    <w:basedOn w:val="TableNormal"/>
+    <w:uiPriority w:val="39"/>
+    <w:rsid w:val="0094414D"/>
+    <w:pPr>
+      <w:spacing w:after="0" w:line="240" w:lineRule="auto"/>
+    </w:pPr>
+    <w:tblPr>
+      <w:tblBorders>
+        <w:top w:val="single" w:sz="4" w:space="0" w:color="auto"/>
+        <w:left w:val="single" w:sz="4" w:space="0" w:color="auto"/>
+        <w:bottom w:val="single" w:sz="4" w:space="0" w:color="auto"/>
+        <w:right w:val="single" w:sz="4" w:space="0" w:color="auto"/>
+        <w:insideH w:val="single" w:sz="4" w:space="0" w:color="auto"/>
+        <w:insideV w:val="single" w:sz="4" w:space="0" w:color="auto"/>
+      </w:tblBorders>
+    </w:tblPr>
+  </w:style>
+  <w:style w:type="paragraph" w:styleId="NoSpacing">
+    <w:name w:val="No Spacing"/>
+    <w:uiPriority w:val="1"/>
+    <w:qFormat/>
+    <w:rsid w:val="005D107C"/>
+    <w:pPr>
+      <w:spacing w:after="0" w:line="240" w:lineRule="auto"/>
+    </w:pPr>
   </w:style>
 </w:styles>
 </file>

</xml_diff>